<commit_message>
Agregar códigos QR al sitio y al CV
QR a la web y QR con tarjeta de contacto (vCard) en la sección de
contacto, con descargas PNG/SVG y archivo .vcf. El QR de la web también
va en el encabezado de los PDF, el Word y el Markdown del CV.

Co-Authored-By: Claude Opus 5.5 <noreply@anthropic.com>
Claude-Session: https://claude.ai/code/session_0148DUiBNtsfdKywDatfgTQc
</commit_message>
<xml_diff>
--- a/cv/Wilson_Ordonez_CV.docx
+++ b/cv/Wilson_Ordonez_CV.docx
@@ -7,6 +7,54 @@
         <w:spacing w:after="80" w:before="0" w:line="276"/>
       </w:pPr>
       <w:r>
+        <w:drawing>
+          <wp:anchor distT="0" distB="0" distL="114300" distR="0" simplePos="0" allowOverlap="1" behindDoc="0" locked="0" layoutInCell="1" relativeHeight="685800">
+            <wp:simplePos x="0" y="0"/>
+            <wp:positionH relativeFrom="margin">
+              <wp:align>right</wp:align>
+            </wp:positionH>
+            <wp:positionV relativeFrom="margin">
+              <wp:align>top</wp:align>
+            </wp:positionV>
+            <wp:extent cx="685800" cy="685800"/>
+            <wp:effectExtent t="0" r="0" b="0" l="0"/>
+            <wp:wrapSquare wrapText="bothSides" distL="114300"/>
+            <wp:docPr id="1" name="qr_web" descr="Código QR a https://negraldi.github.io/" title="QR"/>
+            <wp:cNvGraphicFramePr>
+              <a:graphicFrameLocks xmlns:a="http://schemas.openxmlformats.org/drawingml/2006/main" noChangeAspect="1"/>
+            </wp:cNvGraphicFramePr>
+            <a:graphic xmlns:a="http://schemas.openxmlformats.org/drawingml/2006/main">
+              <a:graphicData uri="http://schemas.openxmlformats.org/drawingml/2006/picture">
+                <pic:pic xmlns:pic="http://schemas.openxmlformats.org/drawingml/2006/picture">
+                  <pic:nvPicPr>
+                    <pic:cNvPr id="0" name="" descr=""/>
+                    <pic:cNvPicPr>
+                      <a:picLocks noChangeAspect="1" noChangeArrowheads="1"/>
+                    </pic:cNvPicPr>
+                  </pic:nvPicPr>
+                  <pic:blipFill>
+                    <a:blip r:embed="rId8" cstate="none"/>
+                    <a:srcRect/>
+                    <a:stretch>
+                      <a:fillRect/>
+                    </a:stretch>
+                  </pic:blipFill>
+                  <pic:spPr bwMode="auto">
+                    <a:xfrm>
+                      <a:off x="0" y="0"/>
+                      <a:ext cx="685800" cy="685800"/>
+                    </a:xfrm>
+                    <a:prstGeom prst="rect">
+                      <a:avLst/>
+                    </a:prstGeom>
+                  </pic:spPr>
+                </pic:pic>
+              </a:graphicData>
+            </a:graphic>
+          </wp:anchor>
+        </w:drawing>
+      </w:r>
+      <w:r>
         <w:rPr>
           <w:rFonts w:ascii="Calibri" w:cs="Calibri" w:eastAsia="Calibri" w:hAnsi="Calibri"/>
           <w:b/>
@@ -56,7 +104,7 @@
         </w:rPr>
         <w:t xml:space="preserve">  ·  </w:t>
       </w:r>
-      <w:hyperlink w:history="1" r:id="rIdknkidnnfax1q4ek3w0hj-">
+      <w:hyperlink w:history="1" r:id="rIdxgafwaf-85l3bjnnns1io">
         <w:r>
           <w:rPr>
             <w:rFonts w:ascii="Calibri" w:cs="Calibri" w:eastAsia="Calibri" w:hAnsi="Calibri"/>
@@ -77,7 +125,7 @@
         </w:rPr>
         <w:t xml:space="preserve">  ·  </w:t>
       </w:r>
-      <w:hyperlink w:history="1" r:id="rIdykid-qbwrhemmsnijgdjt">
+      <w:hyperlink w:history="1" r:id="rIdosdsrkilpehrv31mqbzmh">
         <w:r>
           <w:rPr>
             <w:rFonts w:ascii="Calibri" w:cs="Calibri" w:eastAsia="Calibri" w:hAnsi="Calibri"/>
@@ -98,7 +146,7 @@
         </w:rPr>
         <w:t xml:space="preserve">  ·  </w:t>
       </w:r>
-      <w:hyperlink w:history="1" r:id="rId7wqtgey1b-7kd7nimtzg_">
+      <w:hyperlink w:history="1" r:id="rId2voltri_bgpd2zsroc-0v">
         <w:r>
           <w:rPr>
             <w:rFonts w:ascii="Calibri" w:cs="Calibri" w:eastAsia="Calibri" w:hAnsi="Calibri"/>
@@ -119,7 +167,7 @@
         </w:rPr>
         <w:t xml:space="preserve">  ·  </w:t>
       </w:r>
-      <w:hyperlink w:history="1" r:id="rIdkva1v3mrvbrikzblu7eao">
+      <w:hyperlink w:history="1" r:id="rIdc5uitu8vg5kptea8ltbfp">
         <w:r>
           <w:rPr>
             <w:rFonts w:ascii="Calibri" w:cs="Calibri" w:eastAsia="Calibri" w:hAnsi="Calibri"/>
@@ -140,7 +188,7 @@
         </w:rPr>
         <w:t xml:space="preserve">  ·  </w:t>
       </w:r>
-      <w:hyperlink w:history="1" r:id="rIdpq8sellhagb18w7sg6jva">
+      <w:hyperlink w:history="1" r:id="rIdbfwfemkphm6zt8rsfj1vv">
         <w:r>
           <w:rPr>
             <w:rFonts w:ascii="Calibri" w:cs="Calibri" w:eastAsia="Calibri" w:hAnsi="Calibri"/>
@@ -1460,7 +1508,7 @@
       <w:pPr>
         <w:spacing w:after="60" w:before="0" w:line="276"/>
       </w:pPr>
-      <w:hyperlink w:history="1" r:id="rIdud06kfrhsomcxw_09wc82">
+      <w:hyperlink w:history="1" r:id="rIdns1n6muypmfcbavyoqgcm">
         <w:r>
           <w:rPr>
             <w:rFonts w:ascii="Calibri" w:cs="Calibri" w:eastAsia="Calibri" w:hAnsi="Calibri"/>
@@ -1575,7 +1623,7 @@
       <w:pPr>
         <w:spacing w:after="60" w:before="0" w:line="276"/>
       </w:pPr>
-      <w:hyperlink w:history="1" r:id="rIdlzjeovgjvb0uvf0m0laj5">
+      <w:hyperlink w:history="1" r:id="rIdjgptagds6w4siqr1pgbjd">
         <w:r>
           <w:rPr>
             <w:rFonts w:ascii="Calibri" w:cs="Calibri" w:eastAsia="Calibri" w:hAnsi="Calibri"/>
@@ -1596,7 +1644,7 @@
         </w:rPr>
         <w:t xml:space="preserve">  ·  </w:t>
       </w:r>
-      <w:hyperlink w:history="1" r:id="rIdzcrnrh9ahlike_kn7ewqk">
+      <w:hyperlink w:history="1" r:id="rIdud2lay6iv_cuindwaag_j">
         <w:r>
           <w:rPr>
             <w:rFonts w:ascii="Calibri" w:cs="Calibri" w:eastAsia="Calibri" w:hAnsi="Calibri"/>
@@ -1617,7 +1665,7 @@
         </w:rPr>
         <w:t xml:space="preserve">  ·  </w:t>
       </w:r>
-      <w:hyperlink w:history="1" r:id="rId960obaayx9yitn63esdod">
+      <w:hyperlink w:history="1" r:id="rIdmy4lck6fmwpt-rb-uy7wo">
         <w:r>
           <w:rPr>
             <w:rFonts w:ascii="Calibri" w:cs="Calibri" w:eastAsia="Calibri" w:hAnsi="Calibri"/>
@@ -2266,7 +2314,7 @@
         </w:rPr>
         <w:t xml:space="preserve">  ·  </w:t>
       </w:r>
-      <w:hyperlink w:history="1" r:id="rId9woconrl7dckm1hh1_wru">
+      <w:hyperlink w:history="1" r:id="rIdgfcmn3w5dpuet6lkezhf-">
         <w:r>
           <w:rPr>
             <w:rFonts w:ascii="Calibri" w:cs="Calibri" w:eastAsia="Calibri" w:hAnsi="Calibri"/>
@@ -2287,7 +2335,7 @@
         </w:rPr>
         <w:t xml:space="preserve">  ·  </w:t>
       </w:r>
-      <w:hyperlink w:history="1" r:id="rIdon32rulmv7y_sutz3vggi">
+      <w:hyperlink w:history="1" r:id="rId-lfupl1fnpdjhy_xnk2ut">
         <w:r>
           <w:rPr>
             <w:rFonts w:ascii="Calibri" w:cs="Calibri" w:eastAsia="Calibri" w:hAnsi="Calibri"/>
@@ -2308,7 +2356,7 @@
         </w:rPr>
         <w:t xml:space="preserve">  ·  </w:t>
       </w:r>
-      <w:hyperlink w:history="1" r:id="rId5tsqih7iq68j5tsejtr_m">
+      <w:hyperlink w:history="1" r:id="rIdw3oeto38kjwsat8m9eibj">
         <w:r>
           <w:rPr>
             <w:rFonts w:ascii="Calibri" w:cs="Calibri" w:eastAsia="Calibri" w:hAnsi="Calibri"/>
@@ -2360,7 +2408,7 @@
         </w:rPr>
         <w:t xml:space="preserve">  ·  </w:t>
       </w:r>
-      <w:hyperlink w:history="1" r:id="rIdr3al2zveo-ocbglugkamd">
+      <w:hyperlink w:history="1" r:id="rId6lhrggxuslkzjra0pmc2j">
         <w:r>
           <w:rPr>
             <w:rFonts w:ascii="Calibri" w:cs="Calibri" w:eastAsia="Calibri" w:hAnsi="Calibri"/>
@@ -2381,7 +2429,7 @@
         </w:rPr>
         <w:t xml:space="preserve">  ·  </w:t>
       </w:r>
-      <w:hyperlink w:history="1" r:id="rIdhtmuh-hjpvnxiisg0t50x">
+      <w:hyperlink w:history="1" r:id="rId_6os-voky0wkhvz5noyx9">
         <w:r>
           <w:rPr>
             <w:rFonts w:ascii="Calibri" w:cs="Calibri" w:eastAsia="Calibri" w:hAnsi="Calibri"/>
@@ -2433,7 +2481,7 @@
         </w:rPr>
         <w:t xml:space="preserve">  ·  </w:t>
       </w:r>
-      <w:hyperlink w:history="1" r:id="rIds4hqeyg9bmmh9ylv-ukmp">
+      <w:hyperlink w:history="1" r:id="rIdqudixvurmlb7y-kzzb7jn">
         <w:r>
           <w:rPr>
             <w:rFonts w:ascii="Calibri" w:cs="Calibri" w:eastAsia="Calibri" w:hAnsi="Calibri"/>
@@ -2454,7 +2502,7 @@
         </w:rPr>
         <w:t xml:space="preserve">  ·  </w:t>
       </w:r>
-      <w:hyperlink w:history="1" r:id="rIdz7gdi_kyfet-qoxrutzpn">
+      <w:hyperlink w:history="1" r:id="rId4a9eelxgqwipkm46jmth-">
         <w:r>
           <w:rPr>
             <w:rFonts w:ascii="Calibri" w:cs="Calibri" w:eastAsia="Calibri" w:hAnsi="Calibri"/>
@@ -2506,7 +2554,7 @@
         </w:rPr>
         <w:t xml:space="preserve">  ·  </w:t>
       </w:r>
-      <w:hyperlink w:history="1" r:id="rIdj4qoucqgbnznvfujm_ro3">
+      <w:hyperlink w:history="1" r:id="rIdvjdvg-d5fbkssyilp4kxm">
         <w:r>
           <w:rPr>
             <w:rFonts w:ascii="Calibri" w:cs="Calibri" w:eastAsia="Calibri" w:hAnsi="Calibri"/>
@@ -2527,7 +2575,7 @@
         </w:rPr>
         <w:t xml:space="preserve">  ·  </w:t>
       </w:r>
-      <w:hyperlink w:history="1" r:id="rIdvmdcjphvusjhydo2zowte">
+      <w:hyperlink w:history="1" r:id="rIdexmpwhzy1gssg5_xjktma">
         <w:r>
           <w:rPr>
             <w:rFonts w:ascii="Calibri" w:cs="Calibri" w:eastAsia="Calibri" w:hAnsi="Calibri"/>
@@ -2579,7 +2627,7 @@
         </w:rPr>
         <w:t xml:space="preserve">  ·  </w:t>
       </w:r>
-      <w:hyperlink w:history="1" r:id="rIddabolcpcrp2lvstoarxz8">
+      <w:hyperlink w:history="1" r:id="rIdnxjj9ufpfltky9pwcqwqo">
         <w:r>
           <w:rPr>
             <w:rFonts w:ascii="Calibri" w:cs="Calibri" w:eastAsia="Calibri" w:hAnsi="Calibri"/>
@@ -2600,7 +2648,7 @@
         </w:rPr>
         <w:t xml:space="preserve">  ·  </w:t>
       </w:r>
-      <w:hyperlink w:history="1" r:id="rIdhcv6kkmxoqhb1lps3ixve">
+      <w:hyperlink w:history="1" r:id="rIdiyyuf6spblod03bhnpeuy">
         <w:r>
           <w:rPr>
             <w:rFonts w:ascii="Calibri" w:cs="Calibri" w:eastAsia="Calibri" w:hAnsi="Calibri"/>
@@ -2652,7 +2700,7 @@
         </w:rPr>
         <w:t xml:space="preserve">  ·  </w:t>
       </w:r>
-      <w:hyperlink w:history="1" r:id="rIdldzklzgtjs47h88yy93i1">
+      <w:hyperlink w:history="1" r:id="rIdync5_qrfx5wholnr4yg4d">
         <w:r>
           <w:rPr>
             <w:rFonts w:ascii="Calibri" w:cs="Calibri" w:eastAsia="Calibri" w:hAnsi="Calibri"/>
@@ -2673,7 +2721,7 @@
         </w:rPr>
         <w:t xml:space="preserve">  ·  </w:t>
       </w:r>
-      <w:hyperlink w:history="1" r:id="rIdcy2n0ju56xse6ospmm5fc">
+      <w:hyperlink w:history="1" r:id="rIdnurovvnwbqqwyf05jgwcf">
         <w:r>
           <w:rPr>
             <w:rFonts w:ascii="Calibri" w:cs="Calibri" w:eastAsia="Calibri" w:hAnsi="Calibri"/>
@@ -2694,7 +2742,7 @@
         </w:rPr>
         <w:t xml:space="preserve">  ·  </w:t>
       </w:r>
-      <w:hyperlink w:history="1" r:id="rIdqe6qf-fv3dcqw5gejx0yi">
+      <w:hyperlink w:history="1" r:id="rIdgoufdoevesg-bmtjtw6a_">
         <w:r>
           <w:rPr>
             <w:rFonts w:ascii="Calibri" w:cs="Calibri" w:eastAsia="Calibri" w:hAnsi="Calibri"/>
@@ -2746,7 +2794,7 @@
         </w:rPr>
         <w:t xml:space="preserve">  ·  </w:t>
       </w:r>
-      <w:hyperlink w:history="1" r:id="rId9ucwg7tvtjlte-t79ara9">
+      <w:hyperlink w:history="1" r:id="rIdynpwa4ts0gg7cblj-hpw_">
         <w:r>
           <w:rPr>
             <w:rFonts w:ascii="Calibri" w:cs="Calibri" w:eastAsia="Calibri" w:hAnsi="Calibri"/>
@@ -2798,7 +2846,7 @@
         </w:rPr>
         <w:t xml:space="preserve">  ·  </w:t>
       </w:r>
-      <w:hyperlink w:history="1" r:id="rIdcdvzhsj4wzhbdjv1jh6u6">
+      <w:hyperlink w:history="1" r:id="rIdkx35oagfrniur76waum4o">
         <w:r>
           <w:rPr>
             <w:rFonts w:ascii="Calibri" w:cs="Calibri" w:eastAsia="Calibri" w:hAnsi="Calibri"/>
@@ -2850,7 +2898,7 @@
         </w:rPr>
         <w:t xml:space="preserve">  ·  </w:t>
       </w:r>
-      <w:hyperlink w:history="1" r:id="rIdxpad7q99vfxb2bvjnkuxc">
+      <w:hyperlink w:history="1" r:id="rIdkozivcy2ydndvyh9j_qur">
         <w:r>
           <w:rPr>
             <w:rFonts w:ascii="Calibri" w:cs="Calibri" w:eastAsia="Calibri" w:hAnsi="Calibri"/>
@@ -2871,7 +2919,7 @@
         </w:rPr>
         <w:t xml:space="preserve">  ·  </w:t>
       </w:r>
-      <w:hyperlink w:history="1" r:id="rIdfilr1yssdvf9wt1w91fzo">
+      <w:hyperlink w:history="1" r:id="rIdt8gtegwwkaio7ccme6hkx">
         <w:r>
           <w:rPr>
             <w:rFonts w:ascii="Calibri" w:cs="Calibri" w:eastAsia="Calibri" w:hAnsi="Calibri"/>

</xml_diff>

<commit_message>
Rediseño 'ficha técnica' basado en el perfil del titular
Portada con ficha de datos (rol, foco, stack, formación, publicación),
retícula con títulos de sección en columna propia y fechas alineadas.
IBM Plex Sans para el texto e IBM Plex Mono solo para fechas y stacks;
paleta casi monocroma con un único color de señal verde azulado.
El mismo sistema se aplica a los PDF, el Word y el paquete LaTeX del CV.
Se eliminan las fuentes Source que ya no se usan.

Co-Authored-By: Claude Opus 5.5 <noreply@anthropic.com>
Claude-Session: https://claude.ai/code/session_0148DUiBNtsfdKywDatfgTQc
</commit_message>
<xml_diff>
--- a/cv/Wilson_Ordonez_CV.docx
+++ b/cv/Wilson_Ordonez_CV.docx
@@ -59,7 +59,7 @@
           <w:rFonts w:ascii="Calibri" w:cs="Calibri" w:eastAsia="Calibri" w:hAnsi="Calibri"/>
           <w:b/>
           <w:bCs/>
-          <w:color w:val="275981"/>
+          <w:color w:val="192123"/>
           <w:sz w:val="44"/>
           <w:szCs w:val="44"/>
         </w:rPr>
@@ -72,10 +72,8 @@
       </w:pPr>
       <w:r>
         <w:rPr>
-          <w:rFonts w:ascii="Cambria" w:cs="Cambria" w:eastAsia="Cambria" w:hAnsi="Cambria"/>
-          <w:i/>
-          <w:iCs/>
-          <w:color w:val="1A222B"/>
+          <w:rFonts w:ascii="Calibri" w:cs="Calibri" w:eastAsia="Calibri" w:hAnsi="Calibri"/>
+          <w:color w:val="5C6568"/>
           <w:sz w:val="30"/>
           <w:szCs w:val="30"/>
         </w:rPr>
@@ -89,7 +87,7 @@
       <w:r>
         <w:rPr>
           <w:rFonts w:ascii="Calibri" w:cs="Calibri" w:eastAsia="Calibri" w:hAnsi="Calibri"/>
-          <w:color w:val="5B646F"/>
+          <w:color w:val="5C6568"/>
           <w:sz w:val="18"/>
           <w:szCs w:val="18"/>
         </w:rPr>
@@ -98,17 +96,17 @@
       <w:r>
         <w:rPr>
           <w:rFonts w:ascii="Calibri" w:cs="Calibri" w:eastAsia="Calibri" w:hAnsi="Calibri"/>
-          <w:color w:val="5B646F"/>
+          <w:color w:val="5C6568"/>
           <w:sz w:val="18"/>
           <w:szCs w:val="18"/>
         </w:rPr>
         <w:t xml:space="preserve">  ·  </w:t>
       </w:r>
-      <w:hyperlink w:history="1" r:id="rIdxgafwaf-85l3bjnnns1io">
+      <w:hyperlink w:history="1" r:id="rId9bixw2_533xy3xacz4qit">
         <w:r>
           <w:rPr>
             <w:rFonts w:ascii="Calibri" w:cs="Calibri" w:eastAsia="Calibri" w:hAnsi="Calibri"/>
-            <w:color w:val="275981"/>
+            <w:color w:val="006C6C"/>
             <w:sz w:val="18"/>
             <w:szCs w:val="18"/>
             <w:u w:val="single"/>
@@ -119,17 +117,17 @@
       <w:r>
         <w:rPr>
           <w:rFonts w:ascii="Calibri" w:cs="Calibri" w:eastAsia="Calibri" w:hAnsi="Calibri"/>
-          <w:color w:val="5B646F"/>
+          <w:color w:val="5C6568"/>
           <w:sz w:val="18"/>
           <w:szCs w:val="18"/>
         </w:rPr>
         <w:t xml:space="preserve">  ·  </w:t>
       </w:r>
-      <w:hyperlink w:history="1" r:id="rIdosdsrkilpehrv31mqbzmh">
+      <w:hyperlink w:history="1" r:id="rIdskn35pfn3kvne7xl7twst">
         <w:r>
           <w:rPr>
             <w:rFonts w:ascii="Calibri" w:cs="Calibri" w:eastAsia="Calibri" w:hAnsi="Calibri"/>
-            <w:color w:val="275981"/>
+            <w:color w:val="006C6C"/>
             <w:sz w:val="18"/>
             <w:szCs w:val="18"/>
             <w:u w:val="single"/>
@@ -140,17 +138,17 @@
       <w:r>
         <w:rPr>
           <w:rFonts w:ascii="Calibri" w:cs="Calibri" w:eastAsia="Calibri" w:hAnsi="Calibri"/>
-          <w:color w:val="5B646F"/>
+          <w:color w:val="5C6568"/>
           <w:sz w:val="18"/>
           <w:szCs w:val="18"/>
         </w:rPr>
         <w:t xml:space="preserve">  ·  </w:t>
       </w:r>
-      <w:hyperlink w:history="1" r:id="rId2voltri_bgpd2zsroc-0v">
+      <w:hyperlink w:history="1" r:id="rIdgbcrqfip6g94f0va2_m0m">
         <w:r>
           <w:rPr>
             <w:rFonts w:ascii="Calibri" w:cs="Calibri" w:eastAsia="Calibri" w:hAnsi="Calibri"/>
-            <w:color w:val="275981"/>
+            <w:color w:val="006C6C"/>
             <w:sz w:val="18"/>
             <w:szCs w:val="18"/>
             <w:u w:val="single"/>
@@ -161,17 +159,17 @@
       <w:r>
         <w:rPr>
           <w:rFonts w:ascii="Calibri" w:cs="Calibri" w:eastAsia="Calibri" w:hAnsi="Calibri"/>
-          <w:color w:val="5B646F"/>
+          <w:color w:val="5C6568"/>
           <w:sz w:val="18"/>
           <w:szCs w:val="18"/>
         </w:rPr>
         <w:t xml:space="preserve">  ·  </w:t>
       </w:r>
-      <w:hyperlink w:history="1" r:id="rIdc5uitu8vg5kptea8ltbfp">
+      <w:hyperlink w:history="1" r:id="rIdgjbbd0evcveh4_qunbqnf">
         <w:r>
           <w:rPr>
             <w:rFonts w:ascii="Calibri" w:cs="Calibri" w:eastAsia="Calibri" w:hAnsi="Calibri"/>
-            <w:color w:val="275981"/>
+            <w:color w:val="006C6C"/>
             <w:sz w:val="18"/>
             <w:szCs w:val="18"/>
             <w:u w:val="single"/>
@@ -182,17 +180,17 @@
       <w:r>
         <w:rPr>
           <w:rFonts w:ascii="Calibri" w:cs="Calibri" w:eastAsia="Calibri" w:hAnsi="Calibri"/>
-          <w:color w:val="5B646F"/>
+          <w:color w:val="5C6568"/>
           <w:sz w:val="18"/>
           <w:szCs w:val="18"/>
         </w:rPr>
         <w:t xml:space="preserve">  ·  </w:t>
       </w:r>
-      <w:hyperlink w:history="1" r:id="rIdbfwfemkphm6zt8rsfj1vv">
+      <w:hyperlink w:history="1" r:id="rId7fyobjy1wlgw_3ilwlyuz">
         <w:r>
           <w:rPr>
             <w:rFonts w:ascii="Calibri" w:cs="Calibri" w:eastAsia="Calibri" w:hAnsi="Calibri"/>
-            <w:color w:val="275981"/>
+            <w:color w:val="006C6C"/>
             <w:sz w:val="18"/>
             <w:szCs w:val="18"/>
             <w:u w:val="single"/>
@@ -205,7 +203,7 @@
       <w:pPr>
         <w:keepNext/>
         <w:pBdr>
-          <w:top w:val="single" w:color="D2D8DF" w:sz="4" w:space="8"/>
+          <w:top w:val="single" w:color="D3DBDC" w:sz="4" w:space="8"/>
         </w:pBdr>
         <w:spacing w:after="120" w:before="320"/>
       </w:pPr>
@@ -214,7 +212,7 @@
           <w:rFonts w:ascii="Calibri" w:cs="Calibri" w:eastAsia="Calibri" w:hAnsi="Calibri"/>
           <w:b/>
           <w:bCs/>
-          <w:color w:val="275981"/>
+          <w:color w:val="192123"/>
           <w:sz w:val="25"/>
           <w:szCs w:val="25"/>
         </w:rPr>
@@ -227,8 +225,8 @@
       </w:pPr>
       <w:r>
         <w:rPr>
-          <w:rFonts w:ascii="Cambria" w:cs="Cambria" w:eastAsia="Cambria" w:hAnsi="Cambria"/>
-          <w:color w:val="1A222B"/>
+          <w:rFonts w:ascii="Calibri" w:cs="Calibri" w:eastAsia="Calibri" w:hAnsi="Calibri"/>
+          <w:color w:val="192123"/>
           <w:sz w:val="21"/>
           <w:szCs w:val="21"/>
         </w:rPr>
@@ -239,7 +237,7 @@
       <w:pPr>
         <w:keepNext/>
         <w:pBdr>
-          <w:top w:val="single" w:color="D2D8DF" w:sz="4" w:space="8"/>
+          <w:top w:val="single" w:color="D3DBDC" w:sz="4" w:space="8"/>
         </w:pBdr>
         <w:spacing w:after="120" w:before="320"/>
       </w:pPr>
@@ -248,7 +246,7 @@
           <w:rFonts w:ascii="Calibri" w:cs="Calibri" w:eastAsia="Calibri" w:hAnsi="Calibri"/>
           <w:b/>
           <w:bCs/>
-          <w:color w:val="275981"/>
+          <w:color w:val="192123"/>
           <w:sz w:val="25"/>
           <w:szCs w:val="25"/>
         </w:rPr>
@@ -268,7 +266,7 @@
           <w:rFonts w:ascii="Calibri" w:cs="Calibri" w:eastAsia="Calibri" w:hAnsi="Calibri"/>
           <w:b/>
           <w:bCs/>
-          <w:color w:val="1A222B"/>
+          <w:color w:val="192123"/>
           <w:sz w:val="21"/>
           <w:szCs w:val="21"/>
         </w:rPr>
@@ -276,10 +274,10 @@
       </w:r>
       <w:r>
         <w:rPr>
-          <w:rFonts w:ascii="Calibri" w:cs="Calibri" w:eastAsia="Calibri" w:hAnsi="Calibri"/>
-          <w:color w:val="5B646F"/>
-          <w:sz w:val="17"/>
-          <w:szCs w:val="17"/>
+          <w:rFonts w:ascii="Consolas" w:cs="Consolas" w:eastAsia="Consolas" w:hAnsi="Consolas"/>
+          <w:color w:val="5C6568"/>
+          <w:sz w:val="16"/>
+          <w:szCs w:val="16"/>
         </w:rPr>
         <w:t xml:space="preserve">	nov. 2018 – actualidad</w:t>
       </w:r>
@@ -292,7 +290,7 @@
       <w:r>
         <w:rPr>
           <w:rFonts w:ascii="Calibri" w:cs="Calibri" w:eastAsia="Calibri" w:hAnsi="Calibri"/>
-          <w:color w:val="5B646F"/>
+          <w:color w:val="5C6568"/>
           <w:sz w:val="17"/>
           <w:szCs w:val="17"/>
         </w:rPr>
@@ -306,7 +304,7 @@
       <w:r>
         <w:rPr>
           <w:rFonts w:ascii="Calibri" w:cs="Calibri" w:eastAsia="Calibri" w:hAnsi="Calibri"/>
-          <w:color w:val="1A222B"/>
+          <w:color w:val="192123"/>
           <w:sz w:val="21"/>
           <w:szCs w:val="21"/>
         </w:rPr>
@@ -314,10 +312,10 @@
       </w:r>
       <w:r>
         <w:rPr>
-          <w:rFonts w:ascii="Calibri" w:cs="Calibri" w:eastAsia="Calibri" w:hAnsi="Calibri"/>
-          <w:color w:val="5B646F"/>
-          <w:sz w:val="17"/>
-          <w:szCs w:val="17"/>
+          <w:rFonts w:ascii="Consolas" w:cs="Consolas" w:eastAsia="Consolas" w:hAnsi="Consolas"/>
+          <w:color w:val="5C6568"/>
+          <w:sz w:val="16"/>
+          <w:szCs w:val="16"/>
         </w:rPr>
         <w:t xml:space="preserve">   ene. 2025 – actualidad</w:t>
       </w:r>
@@ -329,7 +327,7 @@
       <w:r>
         <w:rPr>
           <w:rFonts w:ascii="Calibri" w:cs="Calibri" w:eastAsia="Calibri" w:hAnsi="Calibri"/>
-          <w:color w:val="1A222B"/>
+          <w:color w:val="192123"/>
           <w:sz w:val="21"/>
           <w:szCs w:val="21"/>
         </w:rPr>
@@ -337,10 +335,10 @@
       </w:r>
       <w:r>
         <w:rPr>
-          <w:rFonts w:ascii="Calibri" w:cs="Calibri" w:eastAsia="Calibri" w:hAnsi="Calibri"/>
-          <w:color w:val="5B646F"/>
-          <w:sz w:val="17"/>
-          <w:szCs w:val="17"/>
+          <w:rFonts w:ascii="Consolas" w:cs="Consolas" w:eastAsia="Consolas" w:hAnsi="Consolas"/>
+          <w:color w:val="5C6568"/>
+          <w:sz w:val="16"/>
+          <w:szCs w:val="16"/>
         </w:rPr>
         <w:t xml:space="preserve">   abr. 2023 – dic. 2024</w:t>
       </w:r>
@@ -352,7 +350,7 @@
       <w:r>
         <w:rPr>
           <w:rFonts w:ascii="Calibri" w:cs="Calibri" w:eastAsia="Calibri" w:hAnsi="Calibri"/>
-          <w:color w:val="1A222B"/>
+          <w:color w:val="192123"/>
           <w:sz w:val="21"/>
           <w:szCs w:val="21"/>
         </w:rPr>
@@ -360,10 +358,10 @@
       </w:r>
       <w:r>
         <w:rPr>
-          <w:rFonts w:ascii="Calibri" w:cs="Calibri" w:eastAsia="Calibri" w:hAnsi="Calibri"/>
-          <w:color w:val="5B646F"/>
-          <w:sz w:val="17"/>
-          <w:szCs w:val="17"/>
+          <w:rFonts w:ascii="Consolas" w:cs="Consolas" w:eastAsia="Consolas" w:hAnsi="Consolas"/>
+          <w:color w:val="5C6568"/>
+          <w:sz w:val="16"/>
+          <w:szCs w:val="16"/>
         </w:rPr>
         <w:t xml:space="preserve">   nov. 2018 – mar. 2023</w:t>
       </w:r>
@@ -384,8 +382,8 @@
       </w:pPr>
       <w:r>
         <w:rPr>
-          <w:rFonts w:ascii="Cambria" w:cs="Cambria" w:eastAsia="Cambria" w:hAnsi="Cambria"/>
-          <w:color w:val="1A222B"/>
+          <w:rFonts w:ascii="Calibri" w:cs="Calibri" w:eastAsia="Calibri" w:hAnsi="Calibri"/>
+          <w:color w:val="192123"/>
           <w:sz w:val="21"/>
           <w:szCs w:val="21"/>
         </w:rPr>
@@ -403,8 +401,8 @@
       </w:pPr>
       <w:r>
         <w:rPr>
-          <w:rFonts w:ascii="Cambria" w:cs="Cambria" w:eastAsia="Cambria" w:hAnsi="Cambria"/>
-          <w:color w:val="1A222B"/>
+          <w:rFonts w:ascii="Calibri" w:cs="Calibri" w:eastAsia="Calibri" w:hAnsi="Calibri"/>
+          <w:color w:val="192123"/>
           <w:sz w:val="21"/>
           <w:szCs w:val="21"/>
         </w:rPr>
@@ -422,8 +420,8 @@
       </w:pPr>
       <w:r>
         <w:rPr>
-          <w:rFonts w:ascii="Cambria" w:cs="Cambria" w:eastAsia="Cambria" w:hAnsi="Cambria"/>
-          <w:color w:val="1A222B"/>
+          <w:rFonts w:ascii="Calibri" w:cs="Calibri" w:eastAsia="Calibri" w:hAnsi="Calibri"/>
+          <w:color w:val="192123"/>
           <w:sz w:val="21"/>
           <w:szCs w:val="21"/>
         </w:rPr>
@@ -434,7 +432,7 @@
       <w:pPr>
         <w:keepNext/>
         <w:pBdr>
-          <w:top w:val="single" w:color="D2D8DF" w:sz="4" w:space="8"/>
+          <w:top w:val="single" w:color="D3DBDC" w:sz="4" w:space="8"/>
         </w:pBdr>
         <w:spacing w:after="120" w:before="320"/>
       </w:pPr>
@@ -443,7 +441,7 @@
           <w:rFonts w:ascii="Calibri" w:cs="Calibri" w:eastAsia="Calibri" w:hAnsi="Calibri"/>
           <w:b/>
           <w:bCs/>
-          <w:color w:val="275981"/>
+          <w:color w:val="192123"/>
           <w:sz w:val="25"/>
           <w:szCs w:val="25"/>
         </w:rPr>
@@ -463,7 +461,7 @@
           <w:rFonts w:ascii="Calibri" w:cs="Calibri" w:eastAsia="Calibri" w:hAnsi="Calibri"/>
           <w:b/>
           <w:bCs/>
-          <w:color w:val="1A222B"/>
+          <w:color w:val="192123"/>
           <w:sz w:val="21"/>
           <w:szCs w:val="21"/>
         </w:rPr>
@@ -471,10 +469,10 @@
       </w:r>
       <w:r>
         <w:rPr>
-          <w:rFonts w:ascii="Calibri" w:cs="Calibri" w:eastAsia="Calibri" w:hAnsi="Calibri"/>
-          <w:color w:val="5B646F"/>
-          <w:sz w:val="17"/>
-          <w:szCs w:val="17"/>
+          <w:rFonts w:ascii="Consolas" w:cs="Consolas" w:eastAsia="Consolas" w:hAnsi="Consolas"/>
+          <w:color w:val="5C6568"/>
+          <w:sz w:val="16"/>
+          <w:szCs w:val="16"/>
         </w:rPr>
         <w:t xml:space="preserve">	2025</w:t>
       </w:r>
@@ -486,10 +484,10 @@
       </w:pPr>
       <w:r>
         <w:rPr>
-          <w:rFonts w:ascii="Calibri" w:cs="Calibri" w:eastAsia="Calibri" w:hAnsi="Calibri"/>
-          <w:color w:val="5B646F"/>
-          <w:sz w:val="17"/>
-          <w:szCs w:val="17"/>
+          <w:rFonts w:ascii="Consolas" w:cs="Consolas" w:eastAsia="Consolas" w:hAnsi="Consolas"/>
+          <w:color w:val="5C6568"/>
+          <w:sz w:val="16"/>
+          <w:szCs w:val="16"/>
         </w:rPr>
         <w:t xml:space="preserve">PySpark · Databricks · Hive · XGBoost · NetworkX · igraph</w:t>
       </w:r>
@@ -500,8 +498,8 @@
       </w:pPr>
       <w:r>
         <w:rPr>
-          <w:rFonts w:ascii="Cambria" w:cs="Cambria" w:eastAsia="Cambria" w:hAnsi="Cambria"/>
-          <w:color w:val="1A222B"/>
+          <w:rFonts w:ascii="Calibri" w:cs="Calibri" w:eastAsia="Calibri" w:hAnsi="Calibri"/>
+          <w:color w:val="192123"/>
           <w:sz w:val="21"/>
           <w:szCs w:val="21"/>
         </w:rPr>
@@ -521,7 +519,7 @@
           <w:rFonts w:ascii="Calibri" w:cs="Calibri" w:eastAsia="Calibri" w:hAnsi="Calibri"/>
           <w:b/>
           <w:bCs/>
-          <w:color w:val="1A222B"/>
+          <w:color w:val="192123"/>
           <w:sz w:val="21"/>
           <w:szCs w:val="21"/>
         </w:rPr>
@@ -529,10 +527,10 @@
       </w:r>
       <w:r>
         <w:rPr>
-          <w:rFonts w:ascii="Calibri" w:cs="Calibri" w:eastAsia="Calibri" w:hAnsi="Calibri"/>
-          <w:color w:val="5B646F"/>
-          <w:sz w:val="17"/>
-          <w:szCs w:val="17"/>
+          <w:rFonts w:ascii="Consolas" w:cs="Consolas" w:eastAsia="Consolas" w:hAnsi="Consolas"/>
+          <w:color w:val="5C6568"/>
+          <w:sz w:val="16"/>
+          <w:szCs w:val="16"/>
         </w:rPr>
         <w:t xml:space="preserve">	2025</w:t>
       </w:r>
@@ -544,10 +542,10 @@
       </w:pPr>
       <w:r>
         <w:rPr>
-          <w:rFonts w:ascii="Calibri" w:cs="Calibri" w:eastAsia="Calibri" w:hAnsi="Calibri"/>
-          <w:color w:val="5B646F"/>
-          <w:sz w:val="17"/>
-          <w:szCs w:val="17"/>
+          <w:rFonts w:ascii="Consolas" w:cs="Consolas" w:eastAsia="Consolas" w:hAnsi="Consolas"/>
+          <w:color w:val="5C6568"/>
+          <w:sz w:val="16"/>
+          <w:szCs w:val="16"/>
         </w:rPr>
         <w:t xml:space="preserve">Python · R · API de OpenAI · PCA · ICA</w:t>
       </w:r>
@@ -558,8 +556,8 @@
       </w:pPr>
       <w:r>
         <w:rPr>
-          <w:rFonts w:ascii="Cambria" w:cs="Cambria" w:eastAsia="Cambria" w:hAnsi="Cambria"/>
-          <w:color w:val="1A222B"/>
+          <w:rFonts w:ascii="Calibri" w:cs="Calibri" w:eastAsia="Calibri" w:hAnsi="Calibri"/>
+          <w:color w:val="192123"/>
           <w:sz w:val="21"/>
           <w:szCs w:val="21"/>
         </w:rPr>
@@ -579,7 +577,7 @@
           <w:rFonts w:ascii="Calibri" w:cs="Calibri" w:eastAsia="Calibri" w:hAnsi="Calibri"/>
           <w:b/>
           <w:bCs/>
-          <w:color w:val="1A222B"/>
+          <w:color w:val="192123"/>
           <w:sz w:val="21"/>
           <w:szCs w:val="21"/>
         </w:rPr>
@@ -587,10 +585,10 @@
       </w:r>
       <w:r>
         <w:rPr>
-          <w:rFonts w:ascii="Calibri" w:cs="Calibri" w:eastAsia="Calibri" w:hAnsi="Calibri"/>
-          <w:color w:val="5B646F"/>
-          <w:sz w:val="17"/>
-          <w:szCs w:val="17"/>
+          <w:rFonts w:ascii="Consolas" w:cs="Consolas" w:eastAsia="Consolas" w:hAnsi="Consolas"/>
+          <w:color w:val="5C6568"/>
+          <w:sz w:val="16"/>
+          <w:szCs w:val="16"/>
         </w:rPr>
         <w:t xml:space="preserve">	2025</w:t>
       </w:r>
@@ -602,10 +600,10 @@
       </w:pPr>
       <w:r>
         <w:rPr>
-          <w:rFonts w:ascii="Calibri" w:cs="Calibri" w:eastAsia="Calibri" w:hAnsi="Calibri"/>
-          <w:color w:val="5B646F"/>
-          <w:sz w:val="17"/>
-          <w:szCs w:val="17"/>
+          <w:rFonts w:ascii="Consolas" w:cs="Consolas" w:eastAsia="Consolas" w:hAnsi="Consolas"/>
+          <w:color w:val="5C6568"/>
+          <w:sz w:val="16"/>
+          <w:szCs w:val="16"/>
         </w:rPr>
         <w:t xml:space="preserve">Econometría</w:t>
       </w:r>
@@ -616,8 +614,8 @@
       </w:pPr>
       <w:r>
         <w:rPr>
-          <w:rFonts w:ascii="Cambria" w:cs="Cambria" w:eastAsia="Cambria" w:hAnsi="Cambria"/>
-          <w:color w:val="1A222B"/>
+          <w:rFonts w:ascii="Calibri" w:cs="Calibri" w:eastAsia="Calibri" w:hAnsi="Calibri"/>
+          <w:color w:val="192123"/>
           <w:sz w:val="21"/>
           <w:szCs w:val="21"/>
         </w:rPr>
@@ -637,7 +635,7 @@
           <w:rFonts w:ascii="Calibri" w:cs="Calibri" w:eastAsia="Calibri" w:hAnsi="Calibri"/>
           <w:b/>
           <w:bCs/>
-          <w:color w:val="1A222B"/>
+          <w:color w:val="192123"/>
           <w:sz w:val="21"/>
           <w:szCs w:val="21"/>
         </w:rPr>
@@ -645,10 +643,10 @@
       </w:r>
       <w:r>
         <w:rPr>
-          <w:rFonts w:ascii="Calibri" w:cs="Calibri" w:eastAsia="Calibri" w:hAnsi="Calibri"/>
-          <w:color w:val="5B646F"/>
-          <w:sz w:val="17"/>
-          <w:szCs w:val="17"/>
+          <w:rFonts w:ascii="Consolas" w:cs="Consolas" w:eastAsia="Consolas" w:hAnsi="Consolas"/>
+          <w:color w:val="5C6568"/>
+          <w:sz w:val="16"/>
+          <w:szCs w:val="16"/>
         </w:rPr>
         <w:t xml:space="preserve">	2023</w:t>
       </w:r>
@@ -660,10 +658,10 @@
       </w:pPr>
       <w:r>
         <w:rPr>
-          <w:rFonts w:ascii="Calibri" w:cs="Calibri" w:eastAsia="Calibri" w:hAnsi="Calibri"/>
-          <w:color w:val="5B646F"/>
-          <w:sz w:val="17"/>
-          <w:szCs w:val="17"/>
+          <w:rFonts w:ascii="Consolas" w:cs="Consolas" w:eastAsia="Consolas" w:hAnsi="Consolas"/>
+          <w:color w:val="5C6568"/>
+          <w:sz w:val="16"/>
+          <w:szCs w:val="16"/>
         </w:rPr>
         <w:t xml:space="preserve">R · survival · earth · XGBoost · Sparklyr</w:t>
       </w:r>
@@ -674,8 +672,8 @@
       </w:pPr>
       <w:r>
         <w:rPr>
-          <w:rFonts w:ascii="Cambria" w:cs="Cambria" w:eastAsia="Cambria" w:hAnsi="Cambria"/>
-          <w:color w:val="1A222B"/>
+          <w:rFonts w:ascii="Calibri" w:cs="Calibri" w:eastAsia="Calibri" w:hAnsi="Calibri"/>
+          <w:color w:val="192123"/>
           <w:sz w:val="21"/>
           <w:szCs w:val="21"/>
         </w:rPr>
@@ -695,7 +693,7 @@
           <w:rFonts w:ascii="Calibri" w:cs="Calibri" w:eastAsia="Calibri" w:hAnsi="Calibri"/>
           <w:b/>
           <w:bCs/>
-          <w:color w:val="1A222B"/>
+          <w:color w:val="192123"/>
           <w:sz w:val="21"/>
           <w:szCs w:val="21"/>
         </w:rPr>
@@ -703,10 +701,10 @@
       </w:r>
       <w:r>
         <w:rPr>
-          <w:rFonts w:ascii="Calibri" w:cs="Calibri" w:eastAsia="Calibri" w:hAnsi="Calibri"/>
-          <w:color w:val="5B646F"/>
-          <w:sz w:val="17"/>
-          <w:szCs w:val="17"/>
+          <w:rFonts w:ascii="Consolas" w:cs="Consolas" w:eastAsia="Consolas" w:hAnsi="Consolas"/>
+          <w:color w:val="5C6568"/>
+          <w:sz w:val="16"/>
+          <w:szCs w:val="16"/>
         </w:rPr>
         <w:t xml:space="preserve">	2023</w:t>
       </w:r>
@@ -718,10 +716,10 @@
       </w:pPr>
       <w:r>
         <w:rPr>
-          <w:rFonts w:ascii="Calibri" w:cs="Calibri" w:eastAsia="Calibri" w:hAnsi="Calibri"/>
-          <w:color w:val="5B646F"/>
-          <w:sz w:val="17"/>
-          <w:szCs w:val="17"/>
+          <w:rFonts w:ascii="Consolas" w:cs="Consolas" w:eastAsia="Consolas" w:hAnsi="Consolas"/>
+          <w:color w:val="5C6568"/>
+          <w:sz w:val="16"/>
+          <w:szCs w:val="16"/>
         </w:rPr>
         <w:t xml:space="preserve">Sistemas de recomendación</w:t>
       </w:r>
@@ -732,8 +730,8 @@
       </w:pPr>
       <w:r>
         <w:rPr>
-          <w:rFonts w:ascii="Cambria" w:cs="Cambria" w:eastAsia="Cambria" w:hAnsi="Cambria"/>
-          <w:color w:val="1A222B"/>
+          <w:rFonts w:ascii="Calibri" w:cs="Calibri" w:eastAsia="Calibri" w:hAnsi="Calibri"/>
+          <w:color w:val="192123"/>
           <w:sz w:val="21"/>
           <w:szCs w:val="21"/>
         </w:rPr>
@@ -753,7 +751,7 @@
           <w:rFonts w:ascii="Calibri" w:cs="Calibri" w:eastAsia="Calibri" w:hAnsi="Calibri"/>
           <w:b/>
           <w:bCs/>
-          <w:color w:val="1A222B"/>
+          <w:color w:val="192123"/>
           <w:sz w:val="21"/>
           <w:szCs w:val="21"/>
         </w:rPr>
@@ -761,10 +759,10 @@
       </w:r>
       <w:r>
         <w:rPr>
-          <w:rFonts w:ascii="Calibri" w:cs="Calibri" w:eastAsia="Calibri" w:hAnsi="Calibri"/>
-          <w:color w:val="5B646F"/>
-          <w:sz w:val="17"/>
-          <w:szCs w:val="17"/>
+          <w:rFonts w:ascii="Consolas" w:cs="Consolas" w:eastAsia="Consolas" w:hAnsi="Consolas"/>
+          <w:color w:val="5C6568"/>
+          <w:sz w:val="16"/>
+          <w:szCs w:val="16"/>
         </w:rPr>
         <w:t xml:space="preserve">	2022</w:t>
       </w:r>
@@ -776,10 +774,10 @@
       </w:pPr>
       <w:r>
         <w:rPr>
-          <w:rFonts w:ascii="Calibri" w:cs="Calibri" w:eastAsia="Calibri" w:hAnsi="Calibri"/>
-          <w:color w:val="5B646F"/>
-          <w:sz w:val="17"/>
-          <w:szCs w:val="17"/>
+          <w:rFonts w:ascii="Consolas" w:cs="Consolas" w:eastAsia="Consolas" w:hAnsi="Consolas"/>
+          <w:color w:val="5C6568"/>
+          <w:sz w:val="16"/>
+          <w:szCs w:val="16"/>
         </w:rPr>
         <w:t xml:space="preserve">R · GLMNET · XGBoost · Sparklyr</w:t>
       </w:r>
@@ -790,8 +788,8 @@
       </w:pPr>
       <w:r>
         <w:rPr>
-          <w:rFonts w:ascii="Cambria" w:cs="Cambria" w:eastAsia="Cambria" w:hAnsi="Cambria"/>
-          <w:color w:val="1A222B"/>
+          <w:rFonts w:ascii="Calibri" w:cs="Calibri" w:eastAsia="Calibri" w:hAnsi="Calibri"/>
+          <w:color w:val="192123"/>
           <w:sz w:val="21"/>
           <w:szCs w:val="21"/>
         </w:rPr>
@@ -811,7 +809,7 @@
           <w:rFonts w:ascii="Calibri" w:cs="Calibri" w:eastAsia="Calibri" w:hAnsi="Calibri"/>
           <w:b/>
           <w:bCs/>
-          <w:color w:val="1A222B"/>
+          <w:color w:val="192123"/>
           <w:sz w:val="21"/>
           <w:szCs w:val="21"/>
         </w:rPr>
@@ -819,10 +817,10 @@
       </w:r>
       <w:r>
         <w:rPr>
-          <w:rFonts w:ascii="Calibri" w:cs="Calibri" w:eastAsia="Calibri" w:hAnsi="Calibri"/>
-          <w:color w:val="5B646F"/>
-          <w:sz w:val="17"/>
-          <w:szCs w:val="17"/>
+          <w:rFonts w:ascii="Consolas" w:cs="Consolas" w:eastAsia="Consolas" w:hAnsi="Consolas"/>
+          <w:color w:val="5C6568"/>
+          <w:sz w:val="16"/>
+          <w:szCs w:val="16"/>
         </w:rPr>
         <w:t xml:space="preserve">	2018 – actualidad</w:t>
       </w:r>
@@ -833,8 +831,8 @@
       </w:pPr>
       <w:r>
         <w:rPr>
-          <w:rFonts w:ascii="Cambria" w:cs="Cambria" w:eastAsia="Cambria" w:hAnsi="Cambria"/>
-          <w:color w:val="1A222B"/>
+          <w:rFonts w:ascii="Calibri" w:cs="Calibri" w:eastAsia="Calibri" w:hAnsi="Calibri"/>
+          <w:color w:val="192123"/>
           <w:sz w:val="21"/>
           <w:szCs w:val="21"/>
         </w:rPr>
@@ -845,7 +843,7 @@
       <w:pPr>
         <w:keepNext/>
         <w:pBdr>
-          <w:top w:val="single" w:color="D2D8DF" w:sz="4" w:space="8"/>
+          <w:top w:val="single" w:color="D3DBDC" w:sz="4" w:space="8"/>
         </w:pBdr>
         <w:spacing w:after="120" w:before="320"/>
       </w:pPr>
@@ -854,7 +852,7 @@
           <w:rFonts w:ascii="Calibri" w:cs="Calibri" w:eastAsia="Calibri" w:hAnsi="Calibri"/>
           <w:b/>
           <w:bCs/>
-          <w:color w:val="275981"/>
+          <w:color w:val="192123"/>
           <w:sz w:val="25"/>
           <w:szCs w:val="25"/>
         </w:rPr>
@@ -872,8 +870,8 @@
       </w:pPr>
       <w:r>
         <w:rPr>
-          <w:rFonts w:ascii="Cambria" w:cs="Cambria" w:eastAsia="Cambria" w:hAnsi="Cambria"/>
-          <w:color w:val="1A222B"/>
+          <w:rFonts w:ascii="Calibri" w:cs="Calibri" w:eastAsia="Calibri" w:hAnsi="Calibri"/>
+          <w:color w:val="192123"/>
           <w:sz w:val="21"/>
           <w:szCs w:val="21"/>
         </w:rPr>
@@ -891,8 +889,8 @@
       </w:pPr>
       <w:r>
         <w:rPr>
-          <w:rFonts w:ascii="Cambria" w:cs="Cambria" w:eastAsia="Cambria" w:hAnsi="Cambria"/>
-          <w:color w:val="1A222B"/>
+          <w:rFonts w:ascii="Calibri" w:cs="Calibri" w:eastAsia="Calibri" w:hAnsi="Calibri"/>
+          <w:color w:val="192123"/>
           <w:sz w:val="21"/>
           <w:szCs w:val="21"/>
         </w:rPr>
@@ -910,8 +908,8 @@
       </w:pPr>
       <w:r>
         <w:rPr>
-          <w:rFonts w:ascii="Cambria" w:cs="Cambria" w:eastAsia="Cambria" w:hAnsi="Cambria"/>
-          <w:color w:val="1A222B"/>
+          <w:rFonts w:ascii="Calibri" w:cs="Calibri" w:eastAsia="Calibri" w:hAnsi="Calibri"/>
+          <w:color w:val="192123"/>
           <w:sz w:val="21"/>
           <w:szCs w:val="21"/>
         </w:rPr>
@@ -929,8 +927,8 @@
       </w:pPr>
       <w:r>
         <w:rPr>
-          <w:rFonts w:ascii="Cambria" w:cs="Cambria" w:eastAsia="Cambria" w:hAnsi="Cambria"/>
-          <w:color w:val="1A222B"/>
+          <w:rFonts w:ascii="Calibri" w:cs="Calibri" w:eastAsia="Calibri" w:hAnsi="Calibri"/>
+          <w:color w:val="192123"/>
           <w:sz w:val="21"/>
           <w:szCs w:val="21"/>
         </w:rPr>
@@ -941,7 +939,7 @@
       <w:pPr>
         <w:keepNext/>
         <w:pBdr>
-          <w:top w:val="single" w:color="D2D8DF" w:sz="4" w:space="8"/>
+          <w:top w:val="single" w:color="D3DBDC" w:sz="4" w:space="8"/>
         </w:pBdr>
         <w:spacing w:after="120" w:before="320"/>
       </w:pPr>
@@ -950,7 +948,7 @@
           <w:rFonts w:ascii="Calibri" w:cs="Calibri" w:eastAsia="Calibri" w:hAnsi="Calibri"/>
           <w:b/>
           <w:bCs/>
-          <w:color w:val="275981"/>
+          <w:color w:val="192123"/>
           <w:sz w:val="25"/>
           <w:szCs w:val="25"/>
         </w:rPr>
@@ -970,7 +968,7 @@
           <w:rFonts w:ascii="Calibri" w:cs="Calibri" w:eastAsia="Calibri" w:hAnsi="Calibri"/>
           <w:b/>
           <w:bCs/>
-          <w:color w:val="1A222B"/>
+          <w:color w:val="192123"/>
           <w:sz w:val="21"/>
           <w:szCs w:val="21"/>
         </w:rPr>
@@ -978,10 +976,10 @@
       </w:r>
       <w:r>
         <w:rPr>
-          <w:rFonts w:ascii="Calibri" w:cs="Calibri" w:eastAsia="Calibri" w:hAnsi="Calibri"/>
-          <w:color w:val="5B646F"/>
-          <w:sz w:val="17"/>
-          <w:szCs w:val="17"/>
+          <w:rFonts w:ascii="Consolas" w:cs="Consolas" w:eastAsia="Consolas" w:hAnsi="Consolas"/>
+          <w:color w:val="5C6568"/>
+          <w:sz w:val="16"/>
+          <w:szCs w:val="16"/>
         </w:rPr>
         <w:t xml:space="preserve">	15 may. – 31 oct. 2021</w:t>
       </w:r>
@@ -994,7 +992,7 @@
       <w:r>
         <w:rPr>
           <w:rFonts w:ascii="Calibri" w:cs="Calibri" w:eastAsia="Calibri" w:hAnsi="Calibri"/>
-          <w:color w:val="5B646F"/>
+          <w:color w:val="5C6568"/>
           <w:sz w:val="17"/>
           <w:szCs w:val="17"/>
         </w:rPr>
@@ -1007,8 +1005,8 @@
       </w:pPr>
       <w:r>
         <w:rPr>
-          <w:rFonts w:ascii="Cambria" w:cs="Cambria" w:eastAsia="Cambria" w:hAnsi="Cambria"/>
-          <w:color w:val="1A222B"/>
+          <w:rFonts w:ascii="Calibri" w:cs="Calibri" w:eastAsia="Calibri" w:hAnsi="Calibri"/>
+          <w:color w:val="192123"/>
           <w:sz w:val="21"/>
           <w:szCs w:val="21"/>
         </w:rPr>
@@ -1028,7 +1026,7 @@
           <w:rFonts w:ascii="Calibri" w:cs="Calibri" w:eastAsia="Calibri" w:hAnsi="Calibri"/>
           <w:b/>
           <w:bCs/>
-          <w:color w:val="1A222B"/>
+          <w:color w:val="192123"/>
           <w:sz w:val="21"/>
           <w:szCs w:val="21"/>
         </w:rPr>
@@ -1036,10 +1034,10 @@
       </w:r>
       <w:r>
         <w:rPr>
-          <w:rFonts w:ascii="Calibri" w:cs="Calibri" w:eastAsia="Calibri" w:hAnsi="Calibri"/>
-          <w:color w:val="5B646F"/>
-          <w:sz w:val="17"/>
-          <w:szCs w:val="17"/>
+          <w:rFonts w:ascii="Consolas" w:cs="Consolas" w:eastAsia="Consolas" w:hAnsi="Consolas"/>
+          <w:color w:val="5C6568"/>
+          <w:sz w:val="16"/>
+          <w:szCs w:val="16"/>
         </w:rPr>
         <w:t xml:space="preserve">	jul. 2017 – sep. 2018</w:t>
       </w:r>
@@ -1052,7 +1050,7 @@
       <w:r>
         <w:rPr>
           <w:rFonts w:ascii="Calibri" w:cs="Calibri" w:eastAsia="Calibri" w:hAnsi="Calibri"/>
-          <w:color w:val="5B646F"/>
+          <w:color w:val="5C6568"/>
           <w:sz w:val="17"/>
           <w:szCs w:val="17"/>
         </w:rPr>
@@ -1070,8 +1068,8 @@
       </w:pPr>
       <w:r>
         <w:rPr>
-          <w:rFonts w:ascii="Cambria" w:cs="Cambria" w:eastAsia="Cambria" w:hAnsi="Cambria"/>
-          <w:color w:val="1A222B"/>
+          <w:rFonts w:ascii="Calibri" w:cs="Calibri" w:eastAsia="Calibri" w:hAnsi="Calibri"/>
+          <w:color w:val="192123"/>
           <w:sz w:val="21"/>
           <w:szCs w:val="21"/>
         </w:rPr>
@@ -1089,8 +1087,8 @@
       </w:pPr>
       <w:r>
         <w:rPr>
-          <w:rFonts w:ascii="Cambria" w:cs="Cambria" w:eastAsia="Cambria" w:hAnsi="Cambria"/>
-          <w:color w:val="1A222B"/>
+          <w:rFonts w:ascii="Calibri" w:cs="Calibri" w:eastAsia="Calibri" w:hAnsi="Calibri"/>
+          <w:color w:val="192123"/>
           <w:sz w:val="21"/>
           <w:szCs w:val="21"/>
         </w:rPr>
@@ -1108,8 +1106,8 @@
       </w:pPr>
       <w:r>
         <w:rPr>
-          <w:rFonts w:ascii="Cambria" w:cs="Cambria" w:eastAsia="Cambria" w:hAnsi="Cambria"/>
-          <w:color w:val="1A222B"/>
+          <w:rFonts w:ascii="Calibri" w:cs="Calibri" w:eastAsia="Calibri" w:hAnsi="Calibri"/>
+          <w:color w:val="192123"/>
           <w:sz w:val="21"/>
           <w:szCs w:val="21"/>
         </w:rPr>
@@ -1120,7 +1118,7 @@
       <w:pPr>
         <w:keepNext/>
         <w:pBdr>
-          <w:top w:val="single" w:color="D2D8DF" w:sz="4" w:space="8"/>
+          <w:top w:val="single" w:color="D3DBDC" w:sz="4" w:space="8"/>
         </w:pBdr>
         <w:spacing w:after="120" w:before="320"/>
       </w:pPr>
@@ -1129,7 +1127,7 @@
           <w:rFonts w:ascii="Calibri" w:cs="Calibri" w:eastAsia="Calibri" w:hAnsi="Calibri"/>
           <w:b/>
           <w:bCs/>
-          <w:color w:val="275981"/>
+          <w:color w:val="192123"/>
           <w:sz w:val="25"/>
           <w:szCs w:val="25"/>
         </w:rPr>
@@ -1149,7 +1147,7 @@
           <w:rFonts w:ascii="Calibri" w:cs="Calibri" w:eastAsia="Calibri" w:hAnsi="Calibri"/>
           <w:b/>
           <w:bCs/>
-          <w:color w:val="1A222B"/>
+          <w:color w:val="192123"/>
           <w:sz w:val="21"/>
           <w:szCs w:val="21"/>
         </w:rPr>
@@ -1157,10 +1155,10 @@
       </w:r>
       <w:r>
         <w:rPr>
-          <w:rFonts w:ascii="Calibri" w:cs="Calibri" w:eastAsia="Calibri" w:hAnsi="Calibri"/>
-          <w:color w:val="5B646F"/>
-          <w:sz w:val="17"/>
-          <w:szCs w:val="17"/>
+          <w:rFonts w:ascii="Consolas" w:cs="Consolas" w:eastAsia="Consolas" w:hAnsi="Consolas"/>
+          <w:color w:val="5C6568"/>
+          <w:sz w:val="16"/>
+          <w:szCs w:val="16"/>
         </w:rPr>
         <w:t xml:space="preserve">	ago. – sep. 2016</w:t>
       </w:r>
@@ -1173,7 +1171,7 @@
       <w:r>
         <w:rPr>
           <w:rFonts w:ascii="Calibri" w:cs="Calibri" w:eastAsia="Calibri" w:hAnsi="Calibri"/>
-          <w:color w:val="5B646F"/>
+          <w:color w:val="5C6568"/>
           <w:sz w:val="17"/>
           <w:szCs w:val="17"/>
         </w:rPr>
@@ -1186,8 +1184,8 @@
       </w:pPr>
       <w:r>
         <w:rPr>
-          <w:rFonts w:ascii="Cambria" w:cs="Cambria" w:eastAsia="Cambria" w:hAnsi="Cambria"/>
-          <w:color w:val="1A222B"/>
+          <w:rFonts w:ascii="Calibri" w:cs="Calibri" w:eastAsia="Calibri" w:hAnsi="Calibri"/>
+          <w:color w:val="192123"/>
           <w:sz w:val="21"/>
           <w:szCs w:val="21"/>
         </w:rPr>
@@ -1207,7 +1205,7 @@
           <w:rFonts w:ascii="Calibri" w:cs="Calibri" w:eastAsia="Calibri" w:hAnsi="Calibri"/>
           <w:b/>
           <w:bCs/>
-          <w:color w:val="1A222B"/>
+          <w:color w:val="192123"/>
           <w:sz w:val="21"/>
           <w:szCs w:val="21"/>
         </w:rPr>
@@ -1215,10 +1213,10 @@
       </w:r>
       <w:r>
         <w:rPr>
-          <w:rFonts w:ascii="Calibri" w:cs="Calibri" w:eastAsia="Calibri" w:hAnsi="Calibri"/>
-          <w:color w:val="5B646F"/>
-          <w:sz w:val="17"/>
-          <w:szCs w:val="17"/>
+          <w:rFonts w:ascii="Consolas" w:cs="Consolas" w:eastAsia="Consolas" w:hAnsi="Consolas"/>
+          <w:color w:val="5C6568"/>
+          <w:sz w:val="16"/>
+          <w:szCs w:val="16"/>
         </w:rPr>
         <w:t xml:space="preserve">	2014 – 2016</w:t>
       </w:r>
@@ -1231,7 +1229,7 @@
       <w:r>
         <w:rPr>
           <w:rFonts w:ascii="Calibri" w:cs="Calibri" w:eastAsia="Calibri" w:hAnsi="Calibri"/>
-          <w:color w:val="5B646F"/>
+          <w:color w:val="5C6568"/>
           <w:sz w:val="17"/>
           <w:szCs w:val="17"/>
         </w:rPr>
@@ -1244,8 +1242,8 @@
       </w:pPr>
       <w:r>
         <w:rPr>
-          <w:rFonts w:ascii="Cambria" w:cs="Cambria" w:eastAsia="Cambria" w:hAnsi="Cambria"/>
-          <w:color w:val="1A222B"/>
+          <w:rFonts w:ascii="Calibri" w:cs="Calibri" w:eastAsia="Calibri" w:hAnsi="Calibri"/>
+          <w:color w:val="192123"/>
           <w:sz w:val="21"/>
           <w:szCs w:val="21"/>
         </w:rPr>
@@ -1265,7 +1263,7 @@
           <w:rFonts w:ascii="Calibri" w:cs="Calibri" w:eastAsia="Calibri" w:hAnsi="Calibri"/>
           <w:b/>
           <w:bCs/>
-          <w:color w:val="1A222B"/>
+          <w:color w:val="192123"/>
           <w:sz w:val="21"/>
           <w:szCs w:val="21"/>
         </w:rPr>
@@ -1273,10 +1271,10 @@
       </w:r>
       <w:r>
         <w:rPr>
-          <w:rFonts w:ascii="Calibri" w:cs="Calibri" w:eastAsia="Calibri" w:hAnsi="Calibri"/>
-          <w:color w:val="5B646F"/>
-          <w:sz w:val="17"/>
-          <w:szCs w:val="17"/>
+          <w:rFonts w:ascii="Consolas" w:cs="Consolas" w:eastAsia="Consolas" w:hAnsi="Consolas"/>
+          <w:color w:val="5C6568"/>
+          <w:sz w:val="16"/>
+          <w:szCs w:val="16"/>
         </w:rPr>
         <w:t xml:space="preserve">	7 abr. – 8 may. 2015</w:t>
       </w:r>
@@ -1289,7 +1287,7 @@
       <w:r>
         <w:rPr>
           <w:rFonts w:ascii="Calibri" w:cs="Calibri" w:eastAsia="Calibri" w:hAnsi="Calibri"/>
-          <w:color w:val="5B646F"/>
+          <w:color w:val="5C6568"/>
           <w:sz w:val="17"/>
           <w:szCs w:val="17"/>
         </w:rPr>
@@ -1302,8 +1300,8 @@
       </w:pPr>
       <w:r>
         <w:rPr>
-          <w:rFonts w:ascii="Cambria" w:cs="Cambria" w:eastAsia="Cambria" w:hAnsi="Cambria"/>
-          <w:color w:val="1A222B"/>
+          <w:rFonts w:ascii="Calibri" w:cs="Calibri" w:eastAsia="Calibri" w:hAnsi="Calibri"/>
+          <w:color w:val="192123"/>
           <w:sz w:val="21"/>
           <w:szCs w:val="21"/>
         </w:rPr>
@@ -1323,7 +1321,7 @@
           <w:rFonts w:ascii="Calibri" w:cs="Calibri" w:eastAsia="Calibri" w:hAnsi="Calibri"/>
           <w:b/>
           <w:bCs/>
-          <w:color w:val="1A222B"/>
+          <w:color w:val="192123"/>
           <w:sz w:val="21"/>
           <w:szCs w:val="21"/>
         </w:rPr>
@@ -1331,10 +1329,10 @@
       </w:r>
       <w:r>
         <w:rPr>
-          <w:rFonts w:ascii="Calibri" w:cs="Calibri" w:eastAsia="Calibri" w:hAnsi="Calibri"/>
-          <w:color w:val="5B646F"/>
-          <w:sz w:val="17"/>
-          <w:szCs w:val="17"/>
+          <w:rFonts w:ascii="Consolas" w:cs="Consolas" w:eastAsia="Consolas" w:hAnsi="Consolas"/>
+          <w:color w:val="5C6568"/>
+          <w:sz w:val="16"/>
+          <w:szCs w:val="16"/>
         </w:rPr>
         <w:t xml:space="preserve">	2014</w:t>
       </w:r>
@@ -1347,7 +1345,7 @@
       <w:r>
         <w:rPr>
           <w:rFonts w:ascii="Calibri" w:cs="Calibri" w:eastAsia="Calibri" w:hAnsi="Calibri"/>
-          <w:color w:val="5B646F"/>
+          <w:color w:val="5C6568"/>
           <w:sz w:val="17"/>
           <w:szCs w:val="17"/>
         </w:rPr>
@@ -1360,8 +1358,8 @@
       </w:pPr>
       <w:r>
         <w:rPr>
-          <w:rFonts w:ascii="Cambria" w:cs="Cambria" w:eastAsia="Cambria" w:hAnsi="Cambria"/>
-          <w:color w:val="1A222B"/>
+          <w:rFonts w:ascii="Calibri" w:cs="Calibri" w:eastAsia="Calibri" w:hAnsi="Calibri"/>
+          <w:color w:val="192123"/>
           <w:sz w:val="21"/>
           <w:szCs w:val="21"/>
         </w:rPr>
@@ -1372,7 +1370,7 @@
       <w:pPr>
         <w:keepNext/>
         <w:pBdr>
-          <w:top w:val="single" w:color="D2D8DF" w:sz="4" w:space="8"/>
+          <w:top w:val="single" w:color="D3DBDC" w:sz="4" w:space="8"/>
         </w:pBdr>
         <w:spacing w:after="120" w:before="320"/>
       </w:pPr>
@@ -1381,7 +1379,7 @@
           <w:rFonts w:ascii="Calibri" w:cs="Calibri" w:eastAsia="Calibri" w:hAnsi="Calibri"/>
           <w:b/>
           <w:bCs/>
-          <w:color w:val="275981"/>
+          <w:color w:val="192123"/>
           <w:sz w:val="25"/>
           <w:szCs w:val="25"/>
         </w:rPr>
@@ -1401,7 +1399,7 @@
           <w:rFonts w:ascii="Calibri" w:cs="Calibri" w:eastAsia="Calibri" w:hAnsi="Calibri"/>
           <w:b/>
           <w:bCs/>
-          <w:color w:val="1A222B"/>
+          <w:color w:val="192123"/>
           <w:sz w:val="21"/>
           <w:szCs w:val="21"/>
         </w:rPr>
@@ -1409,10 +1407,10 @@
       </w:r>
       <w:r>
         <w:rPr>
-          <w:rFonts w:ascii="Calibri" w:cs="Calibri" w:eastAsia="Calibri" w:hAnsi="Calibri"/>
-          <w:color w:val="5B646F"/>
-          <w:sz w:val="17"/>
-          <w:szCs w:val="17"/>
+          <w:rFonts w:ascii="Consolas" w:cs="Consolas" w:eastAsia="Consolas" w:hAnsi="Consolas"/>
+          <w:color w:val="5C6568"/>
+          <w:sz w:val="16"/>
+          <w:szCs w:val="16"/>
         </w:rPr>
         <w:t xml:space="preserve">	título: 10 abr. 2026</w:t>
       </w:r>
@@ -1425,7 +1423,7 @@
       <w:r>
         <w:rPr>
           <w:rFonts w:ascii="Calibri" w:cs="Calibri" w:eastAsia="Calibri" w:hAnsi="Calibri"/>
-          <w:color w:val="5B646F"/>
+          <w:color w:val="5C6568"/>
           <w:sz w:val="17"/>
           <w:szCs w:val="17"/>
         </w:rPr>
@@ -1438,8 +1436,8 @@
       </w:pPr>
       <w:r>
         <w:rPr>
-          <w:rFonts w:ascii="Cambria" w:cs="Cambria" w:eastAsia="Cambria" w:hAnsi="Cambria"/>
-          <w:color w:val="1A222B"/>
+          <w:rFonts w:ascii="Calibri" w:cs="Calibri" w:eastAsia="Calibri" w:hAnsi="Calibri"/>
+          <w:color w:val="192123"/>
           <w:sz w:val="21"/>
           <w:szCs w:val="21"/>
         </w:rPr>
@@ -1459,7 +1457,7 @@
           <w:rFonts w:ascii="Calibri" w:cs="Calibri" w:eastAsia="Calibri" w:hAnsi="Calibri"/>
           <w:b/>
           <w:bCs/>
-          <w:color w:val="1A222B"/>
+          <w:color w:val="192123"/>
           <w:sz w:val="21"/>
           <w:szCs w:val="21"/>
         </w:rPr>
@@ -1467,10 +1465,10 @@
       </w:r>
       <w:r>
         <w:rPr>
-          <w:rFonts w:ascii="Calibri" w:cs="Calibri" w:eastAsia="Calibri" w:hAnsi="Calibri"/>
-          <w:color w:val="5B646F"/>
-          <w:sz w:val="17"/>
-          <w:szCs w:val="17"/>
+          <w:rFonts w:ascii="Consolas" w:cs="Consolas" w:eastAsia="Consolas" w:hAnsi="Consolas"/>
+          <w:color w:val="5C6568"/>
+          <w:sz w:val="16"/>
+          <w:szCs w:val="16"/>
         </w:rPr>
         <w:t xml:space="preserve">	2012 – 2017</w:t>
       </w:r>
@@ -1483,7 +1481,7 @@
       <w:r>
         <w:rPr>
           <w:rFonts w:ascii="Calibri" w:cs="Calibri" w:eastAsia="Calibri" w:hAnsi="Calibri"/>
-          <w:color w:val="5B646F"/>
+          <w:color w:val="5C6568"/>
           <w:sz w:val="17"/>
           <w:szCs w:val="17"/>
         </w:rPr>
@@ -1496,8 +1494,8 @@
       </w:pPr>
       <w:r>
         <w:rPr>
-          <w:rFonts w:ascii="Cambria" w:cs="Cambria" w:eastAsia="Cambria" w:hAnsi="Cambria"/>
-          <w:color w:val="1A222B"/>
+          <w:rFonts w:ascii="Calibri" w:cs="Calibri" w:eastAsia="Calibri" w:hAnsi="Calibri"/>
+          <w:color w:val="192123"/>
           <w:sz w:val="21"/>
           <w:szCs w:val="21"/>
         </w:rPr>
@@ -1508,11 +1506,11 @@
       <w:pPr>
         <w:spacing w:after="60" w:before="0" w:line="276"/>
       </w:pPr>
-      <w:hyperlink w:history="1" r:id="rIdns1n6muypmfcbavyoqgcm">
+      <w:hyperlink w:history="1" r:id="rIdcokd5kisxcry71hlqliif">
         <w:r>
           <w:rPr>
             <w:rFonts w:ascii="Calibri" w:cs="Calibri" w:eastAsia="Calibri" w:hAnsi="Calibri"/>
-            <w:color w:val="275981"/>
+            <w:color w:val="006C6C"/>
             <w:sz w:val="18"/>
             <w:szCs w:val="18"/>
             <w:u w:val="single"/>
@@ -1534,7 +1532,7 @@
           <w:rFonts w:ascii="Calibri" w:cs="Calibri" w:eastAsia="Calibri" w:hAnsi="Calibri"/>
           <w:b/>
           <w:bCs/>
-          <w:color w:val="1A222B"/>
+          <w:color w:val="192123"/>
           <w:sz w:val="21"/>
           <w:szCs w:val="21"/>
         </w:rPr>
@@ -1542,10 +1540,10 @@
       </w:r>
       <w:r>
         <w:rPr>
-          <w:rFonts w:ascii="Calibri" w:cs="Calibri" w:eastAsia="Calibri" w:hAnsi="Calibri"/>
-          <w:color w:val="5B646F"/>
-          <w:sz w:val="17"/>
-          <w:szCs w:val="17"/>
+          <w:rFonts w:ascii="Consolas" w:cs="Consolas" w:eastAsia="Consolas" w:hAnsi="Consolas"/>
+          <w:color w:val="5C6568"/>
+          <w:sz w:val="16"/>
+          <w:szCs w:val="16"/>
         </w:rPr>
         <w:t xml:space="preserve">	2012</w:t>
       </w:r>
@@ -1558,7 +1556,7 @@
       <w:r>
         <w:rPr>
           <w:rFonts w:ascii="Calibri" w:cs="Calibri" w:eastAsia="Calibri" w:hAnsi="Calibri"/>
-          <w:color w:val="5B646F"/>
+          <w:color w:val="5C6568"/>
           <w:sz w:val="17"/>
           <w:szCs w:val="17"/>
         </w:rPr>
@@ -1569,7 +1567,7 @@
       <w:pPr>
         <w:keepNext/>
         <w:pBdr>
-          <w:top w:val="single" w:color="D2D8DF" w:sz="4" w:space="8"/>
+          <w:top w:val="single" w:color="D3DBDC" w:sz="4" w:space="8"/>
         </w:pBdr>
         <w:spacing w:after="120" w:before="320"/>
       </w:pPr>
@@ -1578,7 +1576,7 @@
           <w:rFonts w:ascii="Calibri" w:cs="Calibri" w:eastAsia="Calibri" w:hAnsi="Calibri"/>
           <w:b/>
           <w:bCs/>
-          <w:color w:val="275981"/>
+          <w:color w:val="192123"/>
           <w:sz w:val="25"/>
           <w:szCs w:val="25"/>
         </w:rPr>
@@ -1591,8 +1589,8 @@
       </w:pPr>
       <w:r>
         <w:rPr>
-          <w:rFonts w:ascii="Cambria" w:cs="Cambria" w:eastAsia="Cambria" w:hAnsi="Cambria"/>
-          <w:color w:val="1A222B"/>
+          <w:rFonts w:ascii="Calibri" w:cs="Calibri" w:eastAsia="Calibri" w:hAnsi="Calibri"/>
+          <w:color w:val="192123"/>
           <w:sz w:val="21"/>
           <w:szCs w:val="21"/>
         </w:rPr>
@@ -1600,10 +1598,10 @@
       </w:r>
       <w:r>
         <w:rPr>
-          <w:rFonts w:ascii="Cambria" w:cs="Cambria" w:eastAsia="Cambria" w:hAnsi="Cambria"/>
-          <w:b/>
-          <w:bCs/>
-          <w:color w:val="1A222B"/>
+          <w:rFonts w:ascii="Calibri" w:cs="Calibri" w:eastAsia="Calibri" w:hAnsi="Calibri"/>
+          <w:b/>
+          <w:bCs/>
+          <w:color w:val="192123"/>
           <w:sz w:val="21"/>
           <w:szCs w:val="21"/>
         </w:rPr>
@@ -1611,8 +1609,8 @@
       </w:r>
       <w:r>
         <w:rPr>
-          <w:rFonts w:ascii="Cambria" w:cs="Cambria" w:eastAsia="Cambria" w:hAnsi="Cambria"/>
-          <w:color w:val="1A222B"/>
+          <w:rFonts w:ascii="Calibri" w:cs="Calibri" w:eastAsia="Calibri" w:hAnsi="Calibri"/>
+          <w:color w:val="192123"/>
           <w:sz w:val="21"/>
           <w:szCs w:val="21"/>
         </w:rPr>
@@ -1623,11 +1621,11 @@
       <w:pPr>
         <w:spacing w:after="60" w:before="0" w:line="276"/>
       </w:pPr>
-      <w:hyperlink w:history="1" r:id="rIdjgptagds6w4siqr1pgbjd">
+      <w:hyperlink w:history="1" r:id="rId9s5u4vi8tl26ymlepcnbi">
         <w:r>
           <w:rPr>
             <w:rFonts w:ascii="Calibri" w:cs="Calibri" w:eastAsia="Calibri" w:hAnsi="Calibri"/>
-            <w:color w:val="275981"/>
+            <w:color w:val="006C6C"/>
             <w:sz w:val="18"/>
             <w:szCs w:val="18"/>
             <w:u w:val="single"/>
@@ -1638,17 +1636,17 @@
       <w:r>
         <w:rPr>
           <w:rFonts w:ascii="Calibri" w:cs="Calibri" w:eastAsia="Calibri" w:hAnsi="Calibri"/>
-          <w:color w:val="5B646F"/>
+          <w:color w:val="5C6568"/>
           <w:sz w:val="18"/>
           <w:szCs w:val="18"/>
         </w:rPr>
         <w:t xml:space="preserve">  ·  </w:t>
       </w:r>
-      <w:hyperlink w:history="1" r:id="rIdud2lay6iv_cuindwaag_j">
+      <w:hyperlink w:history="1" r:id="rIdps_e3gq92g9rcbmk5dg3a">
         <w:r>
           <w:rPr>
             <w:rFonts w:ascii="Calibri" w:cs="Calibri" w:eastAsia="Calibri" w:hAnsi="Calibri"/>
-            <w:color w:val="275981"/>
+            <w:color w:val="006C6C"/>
             <w:sz w:val="18"/>
             <w:szCs w:val="18"/>
             <w:u w:val="single"/>
@@ -1659,17 +1657,17 @@
       <w:r>
         <w:rPr>
           <w:rFonts w:ascii="Calibri" w:cs="Calibri" w:eastAsia="Calibri" w:hAnsi="Calibri"/>
-          <w:color w:val="5B646F"/>
+          <w:color w:val="5C6568"/>
           <w:sz w:val="18"/>
           <w:szCs w:val="18"/>
         </w:rPr>
         <w:t xml:space="preserve">  ·  </w:t>
       </w:r>
-      <w:hyperlink w:history="1" r:id="rIdmy4lck6fmwpt-rb-uy7wo">
+      <w:hyperlink w:history="1" r:id="rIdmb490ehpnoxubvc_r49oj">
         <w:r>
           <w:rPr>
             <w:rFonts w:ascii="Calibri" w:cs="Calibri" w:eastAsia="Calibri" w:hAnsi="Calibri"/>
-            <w:color w:val="275981"/>
+            <w:color w:val="006C6C"/>
             <w:sz w:val="18"/>
             <w:szCs w:val="18"/>
             <w:u w:val="single"/>
@@ -1686,7 +1684,7 @@
       <w:r>
         <w:rPr>
           <w:rFonts w:ascii="Calibri" w:cs="Calibri" w:eastAsia="Calibri" w:hAnsi="Calibri"/>
-          <w:color w:val="5B646F"/>
+          <w:color w:val="5C6568"/>
           <w:sz w:val="17"/>
           <w:szCs w:val="17"/>
         </w:rPr>
@@ -1697,7 +1695,7 @@
       <w:pPr>
         <w:keepNext/>
         <w:pBdr>
-          <w:top w:val="single" w:color="D2D8DF" w:sz="4" w:space="8"/>
+          <w:top w:val="single" w:color="D3DBDC" w:sz="4" w:space="8"/>
         </w:pBdr>
         <w:spacing w:after="120" w:before="320"/>
       </w:pPr>
@@ -1706,7 +1704,7 @@
           <w:rFonts w:ascii="Calibri" w:cs="Calibri" w:eastAsia="Calibri" w:hAnsi="Calibri"/>
           <w:b/>
           <w:bCs/>
-          <w:color w:val="275981"/>
+          <w:color w:val="192123"/>
           <w:sz w:val="25"/>
           <w:szCs w:val="25"/>
         </w:rPr>
@@ -1722,7 +1720,7 @@
           <w:rFonts w:ascii="Calibri" w:cs="Calibri" w:eastAsia="Calibri" w:hAnsi="Calibri"/>
           <w:b/>
           <w:bCs/>
-          <w:color w:val="1A222B"/>
+          <w:color w:val="192123"/>
           <w:sz w:val="21"/>
           <w:szCs w:val="21"/>
         </w:rPr>
@@ -1730,8 +1728,8 @@
       </w:r>
       <w:r>
         <w:rPr>
-          <w:rFonts w:ascii="Cambria" w:cs="Cambria" w:eastAsia="Cambria" w:hAnsi="Cambria"/>
-          <w:color w:val="1A222B"/>
+          <w:rFonts w:ascii="Calibri" w:cs="Calibri" w:eastAsia="Calibri" w:hAnsi="Calibri"/>
+          <w:color w:val="192123"/>
           <w:sz w:val="21"/>
           <w:szCs w:val="21"/>
         </w:rPr>
@@ -1747,7 +1745,7 @@
           <w:rFonts w:ascii="Calibri" w:cs="Calibri" w:eastAsia="Calibri" w:hAnsi="Calibri"/>
           <w:b/>
           <w:bCs/>
-          <w:color w:val="1A222B"/>
+          <w:color w:val="192123"/>
           <w:sz w:val="21"/>
           <w:szCs w:val="21"/>
         </w:rPr>
@@ -1755,8 +1753,8 @@
       </w:r>
       <w:r>
         <w:rPr>
-          <w:rFonts w:ascii="Cambria" w:cs="Cambria" w:eastAsia="Cambria" w:hAnsi="Cambria"/>
-          <w:color w:val="1A222B"/>
+          <w:rFonts w:ascii="Calibri" w:cs="Calibri" w:eastAsia="Calibri" w:hAnsi="Calibri"/>
+          <w:color w:val="192123"/>
           <w:sz w:val="21"/>
           <w:szCs w:val="21"/>
         </w:rPr>
@@ -1772,7 +1770,7 @@
           <w:rFonts w:ascii="Calibri" w:cs="Calibri" w:eastAsia="Calibri" w:hAnsi="Calibri"/>
           <w:b/>
           <w:bCs/>
-          <w:color w:val="1A222B"/>
+          <w:color w:val="192123"/>
           <w:sz w:val="21"/>
           <w:szCs w:val="21"/>
         </w:rPr>
@@ -1780,8 +1778,8 @@
       </w:r>
       <w:r>
         <w:rPr>
-          <w:rFonts w:ascii="Cambria" w:cs="Cambria" w:eastAsia="Cambria" w:hAnsi="Cambria"/>
-          <w:color w:val="1A222B"/>
+          <w:rFonts w:ascii="Calibri" w:cs="Calibri" w:eastAsia="Calibri" w:hAnsi="Calibri"/>
+          <w:color w:val="192123"/>
           <w:sz w:val="21"/>
           <w:szCs w:val="21"/>
         </w:rPr>
@@ -1797,7 +1795,7 @@
           <w:rFonts w:ascii="Calibri" w:cs="Calibri" w:eastAsia="Calibri" w:hAnsi="Calibri"/>
           <w:b/>
           <w:bCs/>
-          <w:color w:val="1A222B"/>
+          <w:color w:val="192123"/>
           <w:sz w:val="21"/>
           <w:szCs w:val="21"/>
         </w:rPr>
@@ -1805,8 +1803,8 @@
       </w:r>
       <w:r>
         <w:rPr>
-          <w:rFonts w:ascii="Cambria" w:cs="Cambria" w:eastAsia="Cambria" w:hAnsi="Cambria"/>
-          <w:color w:val="1A222B"/>
+          <w:rFonts w:ascii="Calibri" w:cs="Calibri" w:eastAsia="Calibri" w:hAnsi="Calibri"/>
+          <w:color w:val="192123"/>
           <w:sz w:val="21"/>
           <w:szCs w:val="21"/>
         </w:rPr>
@@ -1822,7 +1820,7 @@
           <w:rFonts w:ascii="Calibri" w:cs="Calibri" w:eastAsia="Calibri" w:hAnsi="Calibri"/>
           <w:b/>
           <w:bCs/>
-          <w:color w:val="1A222B"/>
+          <w:color w:val="192123"/>
           <w:sz w:val="21"/>
           <w:szCs w:val="21"/>
         </w:rPr>
@@ -1830,8 +1828,8 @@
       </w:r>
       <w:r>
         <w:rPr>
-          <w:rFonts w:ascii="Cambria" w:cs="Cambria" w:eastAsia="Cambria" w:hAnsi="Cambria"/>
-          <w:color w:val="1A222B"/>
+          <w:rFonts w:ascii="Calibri" w:cs="Calibri" w:eastAsia="Calibri" w:hAnsi="Calibri"/>
+          <w:color w:val="192123"/>
           <w:sz w:val="21"/>
           <w:szCs w:val="21"/>
         </w:rPr>
@@ -1847,7 +1845,7 @@
           <w:rFonts w:ascii="Calibri" w:cs="Calibri" w:eastAsia="Calibri" w:hAnsi="Calibri"/>
           <w:b/>
           <w:bCs/>
-          <w:color w:val="1A222B"/>
+          <w:color w:val="192123"/>
           <w:sz w:val="21"/>
           <w:szCs w:val="21"/>
         </w:rPr>
@@ -1855,8 +1853,8 @@
       </w:r>
       <w:r>
         <w:rPr>
-          <w:rFonts w:ascii="Cambria" w:cs="Cambria" w:eastAsia="Cambria" w:hAnsi="Cambria"/>
-          <w:color w:val="1A222B"/>
+          <w:rFonts w:ascii="Calibri" w:cs="Calibri" w:eastAsia="Calibri" w:hAnsi="Calibri"/>
+          <w:color w:val="192123"/>
           <w:sz w:val="21"/>
           <w:szCs w:val="21"/>
         </w:rPr>
@@ -1872,7 +1870,7 @@
           <w:rFonts w:ascii="Calibri" w:cs="Calibri" w:eastAsia="Calibri" w:hAnsi="Calibri"/>
           <w:b/>
           <w:bCs/>
-          <w:color w:val="1A222B"/>
+          <w:color w:val="192123"/>
           <w:sz w:val="21"/>
           <w:szCs w:val="21"/>
         </w:rPr>
@@ -1880,8 +1878,8 @@
       </w:r>
       <w:r>
         <w:rPr>
-          <w:rFonts w:ascii="Cambria" w:cs="Cambria" w:eastAsia="Cambria" w:hAnsi="Cambria"/>
-          <w:color w:val="1A222B"/>
+          <w:rFonts w:ascii="Calibri" w:cs="Calibri" w:eastAsia="Calibri" w:hAnsi="Calibri"/>
+          <w:color w:val="192123"/>
           <w:sz w:val="21"/>
           <w:szCs w:val="21"/>
         </w:rPr>
@@ -1897,7 +1895,7 @@
           <w:rFonts w:ascii="Calibri" w:cs="Calibri" w:eastAsia="Calibri" w:hAnsi="Calibri"/>
           <w:b/>
           <w:bCs/>
-          <w:color w:val="1A222B"/>
+          <w:color w:val="192123"/>
           <w:sz w:val="21"/>
           <w:szCs w:val="21"/>
         </w:rPr>
@@ -1905,8 +1903,8 @@
       </w:r>
       <w:r>
         <w:rPr>
-          <w:rFonts w:ascii="Cambria" w:cs="Cambria" w:eastAsia="Cambria" w:hAnsi="Cambria"/>
-          <w:color w:val="1A222B"/>
+          <w:rFonts w:ascii="Calibri" w:cs="Calibri" w:eastAsia="Calibri" w:hAnsi="Calibri"/>
+          <w:color w:val="192123"/>
           <w:sz w:val="21"/>
           <w:szCs w:val="21"/>
         </w:rPr>
@@ -1917,7 +1915,7 @@
       <w:pPr>
         <w:keepNext/>
         <w:pBdr>
-          <w:top w:val="single" w:color="D2D8DF" w:sz="4" w:space="8"/>
+          <w:top w:val="single" w:color="D3DBDC" w:sz="4" w:space="8"/>
         </w:pBdr>
         <w:spacing w:after="120" w:before="320"/>
       </w:pPr>
@@ -1926,7 +1924,7 @@
           <w:rFonts w:ascii="Calibri" w:cs="Calibri" w:eastAsia="Calibri" w:hAnsi="Calibri"/>
           <w:b/>
           <w:bCs/>
-          <w:color w:val="275981"/>
+          <w:color w:val="192123"/>
           <w:sz w:val="25"/>
           <w:szCs w:val="25"/>
         </w:rPr>
@@ -1939,8 +1937,8 @@
       </w:pPr>
       <w:r>
         <w:rPr>
-          <w:rFonts w:ascii="Cambria" w:cs="Cambria" w:eastAsia="Cambria" w:hAnsi="Cambria"/>
-          <w:color w:val="1A222B"/>
+          <w:rFonts w:ascii="Calibri" w:cs="Calibri" w:eastAsia="Calibri" w:hAnsi="Calibri"/>
+          <w:color w:val="192123"/>
           <w:sz w:val="21"/>
           <w:szCs w:val="21"/>
         </w:rPr>
@@ -1951,7 +1949,7 @@
       <w:pPr>
         <w:keepNext/>
         <w:pBdr>
-          <w:top w:val="single" w:color="D2D8DF" w:sz="4" w:space="8"/>
+          <w:top w:val="single" w:color="D3DBDC" w:sz="4" w:space="8"/>
         </w:pBdr>
         <w:spacing w:after="120" w:before="320"/>
       </w:pPr>
@@ -1960,7 +1958,7 @@
           <w:rFonts w:ascii="Calibri" w:cs="Calibri" w:eastAsia="Calibri" w:hAnsi="Calibri"/>
           <w:b/>
           <w:bCs/>
-          <w:color w:val="275981"/>
+          <w:color w:val="192123"/>
           <w:sz w:val="25"/>
           <w:szCs w:val="25"/>
         </w:rPr>
@@ -1977,7 +1975,7 @@
       <w:r>
         <w:rPr>
           <w:rFonts w:ascii="Calibri" w:cs="Calibri" w:eastAsia="Calibri" w:hAnsi="Calibri"/>
-          <w:color w:val="1A222B"/>
+          <w:color w:val="192123"/>
           <w:sz w:val="20"/>
           <w:szCs w:val="20"/>
         </w:rPr>
@@ -1985,10 +1983,10 @@
       </w:r>
       <w:r>
         <w:rPr>
-          <w:rFonts w:ascii="Calibri" w:cs="Calibri" w:eastAsia="Calibri" w:hAnsi="Calibri"/>
-          <w:color w:val="5B646F"/>
-          <w:sz w:val="17"/>
-          <w:szCs w:val="17"/>
+          <w:rFonts w:ascii="Consolas" w:cs="Consolas" w:eastAsia="Consolas" w:hAnsi="Consolas"/>
+          <w:color w:val="5C6568"/>
+          <w:sz w:val="16"/>
+          <w:szCs w:val="16"/>
         </w:rPr>
         <w:t xml:space="preserve">	feb. 2019</w:t>
       </w:r>
@@ -2003,7 +2001,7 @@
       <w:r>
         <w:rPr>
           <w:rFonts w:ascii="Calibri" w:cs="Calibri" w:eastAsia="Calibri" w:hAnsi="Calibri"/>
-          <w:color w:val="1A222B"/>
+          <w:color w:val="192123"/>
           <w:sz w:val="20"/>
           <w:szCs w:val="20"/>
         </w:rPr>
@@ -2011,10 +2009,10 @@
       </w:r>
       <w:r>
         <w:rPr>
-          <w:rFonts w:ascii="Calibri" w:cs="Calibri" w:eastAsia="Calibri" w:hAnsi="Calibri"/>
-          <w:color w:val="5B646F"/>
-          <w:sz w:val="17"/>
-          <w:szCs w:val="17"/>
+          <w:rFonts w:ascii="Consolas" w:cs="Consolas" w:eastAsia="Consolas" w:hAnsi="Consolas"/>
+          <w:color w:val="5C6568"/>
+          <w:sz w:val="16"/>
+          <w:szCs w:val="16"/>
         </w:rPr>
         <w:t xml:space="preserve">	sep. 2017</w:t>
       </w:r>
@@ -2029,7 +2027,7 @@
       <w:r>
         <w:rPr>
           <w:rFonts w:ascii="Calibri" w:cs="Calibri" w:eastAsia="Calibri" w:hAnsi="Calibri"/>
-          <w:color w:val="1A222B"/>
+          <w:color w:val="192123"/>
           <w:sz w:val="20"/>
           <w:szCs w:val="20"/>
         </w:rPr>
@@ -2037,10 +2035,10 @@
       </w:r>
       <w:r>
         <w:rPr>
-          <w:rFonts w:ascii="Calibri" w:cs="Calibri" w:eastAsia="Calibri" w:hAnsi="Calibri"/>
-          <w:color w:val="5B646F"/>
-          <w:sz w:val="17"/>
-          <w:szCs w:val="17"/>
+          <w:rFonts w:ascii="Consolas" w:cs="Consolas" w:eastAsia="Consolas" w:hAnsi="Consolas"/>
+          <w:color w:val="5C6568"/>
+          <w:sz w:val="16"/>
+          <w:szCs w:val="16"/>
         </w:rPr>
         <w:t xml:space="preserve">	oct. 2016</w:t>
       </w:r>
@@ -2055,7 +2053,7 @@
       <w:r>
         <w:rPr>
           <w:rFonts w:ascii="Calibri" w:cs="Calibri" w:eastAsia="Calibri" w:hAnsi="Calibri"/>
-          <w:color w:val="1A222B"/>
+          <w:color w:val="192123"/>
           <w:sz w:val="20"/>
           <w:szCs w:val="20"/>
         </w:rPr>
@@ -2063,10 +2061,10 @@
       </w:r>
       <w:r>
         <w:rPr>
-          <w:rFonts w:ascii="Calibri" w:cs="Calibri" w:eastAsia="Calibri" w:hAnsi="Calibri"/>
-          <w:color w:val="5B646F"/>
-          <w:sz w:val="17"/>
-          <w:szCs w:val="17"/>
+          <w:rFonts w:ascii="Consolas" w:cs="Consolas" w:eastAsia="Consolas" w:hAnsi="Consolas"/>
+          <w:color w:val="5C6568"/>
+          <w:sz w:val="16"/>
+          <w:szCs w:val="16"/>
         </w:rPr>
         <w:t xml:space="preserve">	oct. 2016</w:t>
       </w:r>
@@ -2081,7 +2079,7 @@
       <w:r>
         <w:rPr>
           <w:rFonts w:ascii="Calibri" w:cs="Calibri" w:eastAsia="Calibri" w:hAnsi="Calibri"/>
-          <w:color w:val="1A222B"/>
+          <w:color w:val="192123"/>
           <w:sz w:val="20"/>
           <w:szCs w:val="20"/>
         </w:rPr>
@@ -2089,10 +2087,10 @@
       </w:r>
       <w:r>
         <w:rPr>
-          <w:rFonts w:ascii="Calibri" w:cs="Calibri" w:eastAsia="Calibri" w:hAnsi="Calibri"/>
-          <w:color w:val="5B646F"/>
-          <w:sz w:val="17"/>
-          <w:szCs w:val="17"/>
+          <w:rFonts w:ascii="Consolas" w:cs="Consolas" w:eastAsia="Consolas" w:hAnsi="Consolas"/>
+          <w:color w:val="5C6568"/>
+          <w:sz w:val="16"/>
+          <w:szCs w:val="16"/>
         </w:rPr>
         <w:t xml:space="preserve">	oct. 2016</w:t>
       </w:r>
@@ -2107,7 +2105,7 @@
       <w:r>
         <w:rPr>
           <w:rFonts w:ascii="Calibri" w:cs="Calibri" w:eastAsia="Calibri" w:hAnsi="Calibri"/>
-          <w:color w:val="1A222B"/>
+          <w:color w:val="192123"/>
           <w:sz w:val="20"/>
           <w:szCs w:val="20"/>
         </w:rPr>
@@ -2115,10 +2113,10 @@
       </w:r>
       <w:r>
         <w:rPr>
-          <w:rFonts w:ascii="Calibri" w:cs="Calibri" w:eastAsia="Calibri" w:hAnsi="Calibri"/>
-          <w:color w:val="5B646F"/>
-          <w:sz w:val="17"/>
-          <w:szCs w:val="17"/>
+          <w:rFonts w:ascii="Consolas" w:cs="Consolas" w:eastAsia="Consolas" w:hAnsi="Consolas"/>
+          <w:color w:val="5C6568"/>
+          <w:sz w:val="16"/>
+          <w:szCs w:val="16"/>
         </w:rPr>
         <w:t xml:space="preserve">	nov. 2014</w:t>
       </w:r>
@@ -2133,7 +2131,7 @@
       <w:r>
         <w:rPr>
           <w:rFonts w:ascii="Calibri" w:cs="Calibri" w:eastAsia="Calibri" w:hAnsi="Calibri"/>
-          <w:color w:val="1A222B"/>
+          <w:color w:val="192123"/>
           <w:sz w:val="20"/>
           <w:szCs w:val="20"/>
         </w:rPr>
@@ -2141,10 +2139,10 @@
       </w:r>
       <w:r>
         <w:rPr>
-          <w:rFonts w:ascii="Calibri" w:cs="Calibri" w:eastAsia="Calibri" w:hAnsi="Calibri"/>
-          <w:color w:val="5B646F"/>
-          <w:sz w:val="17"/>
-          <w:szCs w:val="17"/>
+          <w:rFonts w:ascii="Consolas" w:cs="Consolas" w:eastAsia="Consolas" w:hAnsi="Consolas"/>
+          <w:color w:val="5C6568"/>
+          <w:sz w:val="16"/>
+          <w:szCs w:val="16"/>
         </w:rPr>
         <w:t xml:space="preserve">	oct. 2014</w:t>
       </w:r>
@@ -2153,7 +2151,7 @@
       <w:pPr>
         <w:keepNext/>
         <w:pBdr>
-          <w:top w:val="single" w:color="D2D8DF" w:sz="4" w:space="8"/>
+          <w:top w:val="single" w:color="D3DBDC" w:sz="4" w:space="8"/>
         </w:pBdr>
         <w:spacing w:after="120" w:before="320"/>
       </w:pPr>
@@ -2162,7 +2160,7 @@
           <w:rFonts w:ascii="Calibri" w:cs="Calibri" w:eastAsia="Calibri" w:hAnsi="Calibri"/>
           <w:b/>
           <w:bCs/>
-          <w:color w:val="275981"/>
+          <w:color w:val="192123"/>
           <w:sz w:val="25"/>
           <w:szCs w:val="25"/>
         </w:rPr>
@@ -2182,7 +2180,7 @@
           <w:rFonts w:ascii="Calibri" w:cs="Calibri" w:eastAsia="Calibri" w:hAnsi="Calibri"/>
           <w:b/>
           <w:bCs/>
-          <w:color w:val="1A222B"/>
+          <w:color w:val="192123"/>
           <w:sz w:val="21"/>
           <w:szCs w:val="21"/>
         </w:rPr>
@@ -2190,10 +2188,10 @@
       </w:r>
       <w:r>
         <w:rPr>
-          <w:rFonts w:ascii="Calibri" w:cs="Calibri" w:eastAsia="Calibri" w:hAnsi="Calibri"/>
-          <w:color w:val="5B646F"/>
-          <w:sz w:val="17"/>
-          <w:szCs w:val="17"/>
+          <w:rFonts w:ascii="Consolas" w:cs="Consolas" w:eastAsia="Consolas" w:hAnsi="Consolas"/>
+          <w:color w:val="5C6568"/>
+          <w:sz w:val="16"/>
+          <w:szCs w:val="16"/>
         </w:rPr>
         <w:t xml:space="preserve">	oct. 2016</w:t>
       </w:r>
@@ -2204,8 +2202,8 @@
       </w:pPr>
       <w:r>
         <w:rPr>
-          <w:rFonts w:ascii="Cambria" w:cs="Cambria" w:eastAsia="Cambria" w:hAnsi="Cambria"/>
-          <w:color w:val="1A222B"/>
+          <w:rFonts w:ascii="Calibri" w:cs="Calibri" w:eastAsia="Calibri" w:hAnsi="Calibri"/>
+          <w:color w:val="192123"/>
           <w:sz w:val="21"/>
           <w:szCs w:val="21"/>
         </w:rPr>
@@ -2225,7 +2223,7 @@
           <w:rFonts w:ascii="Calibri" w:cs="Calibri" w:eastAsia="Calibri" w:hAnsi="Calibri"/>
           <w:b/>
           <w:bCs/>
-          <w:color w:val="1A222B"/>
+          <w:color w:val="192123"/>
           <w:sz w:val="21"/>
           <w:szCs w:val="21"/>
         </w:rPr>
@@ -2233,10 +2231,10 @@
       </w:r>
       <w:r>
         <w:rPr>
-          <w:rFonts w:ascii="Calibri" w:cs="Calibri" w:eastAsia="Calibri" w:hAnsi="Calibri"/>
-          <w:color w:val="5B646F"/>
-          <w:sz w:val="17"/>
-          <w:szCs w:val="17"/>
+          <w:rFonts w:ascii="Consolas" w:cs="Consolas" w:eastAsia="Consolas" w:hAnsi="Consolas"/>
+          <w:color w:val="5C6568"/>
+          <w:sz w:val="16"/>
+          <w:szCs w:val="16"/>
         </w:rPr>
         <w:t xml:space="preserve">	oct. 2014</w:t>
       </w:r>
@@ -2247,8 +2245,8 @@
       </w:pPr>
       <w:r>
         <w:rPr>
-          <w:rFonts w:ascii="Cambria" w:cs="Cambria" w:eastAsia="Cambria" w:hAnsi="Cambria"/>
-          <w:color w:val="1A222B"/>
+          <w:rFonts w:ascii="Calibri" w:cs="Calibri" w:eastAsia="Calibri" w:hAnsi="Calibri"/>
+          <w:color w:val="192123"/>
           <w:sz w:val="21"/>
           <w:szCs w:val="21"/>
         </w:rPr>
@@ -2259,7 +2257,7 @@
       <w:pPr>
         <w:keepNext/>
         <w:pBdr>
-          <w:top w:val="single" w:color="D2D8DF" w:sz="4" w:space="8"/>
+          <w:top w:val="single" w:color="D3DBDC" w:sz="4" w:space="8"/>
         </w:pBdr>
         <w:spacing w:after="120" w:before="320"/>
       </w:pPr>
@@ -2268,7 +2266,7 @@
           <w:rFonts w:ascii="Calibri" w:cs="Calibri" w:eastAsia="Calibri" w:hAnsi="Calibri"/>
           <w:b/>
           <w:bCs/>
-          <w:color w:val="275981"/>
+          <w:color w:val="192123"/>
           <w:sz w:val="25"/>
           <w:szCs w:val="25"/>
         </w:rPr>
@@ -2285,7 +2283,7 @@
           <w:rFonts w:ascii="Calibri" w:cs="Calibri" w:eastAsia="Calibri" w:hAnsi="Calibri"/>
           <w:b/>
           <w:bCs/>
-          <w:color w:val="1A222B"/>
+          <w:color w:val="192123"/>
           <w:sz w:val="21"/>
           <w:szCs w:val="21"/>
         </w:rPr>
@@ -2299,7 +2297,7 @@
       <w:r>
         <w:rPr>
           <w:rFonts w:ascii="Calibri" w:cs="Calibri" w:eastAsia="Calibri" w:hAnsi="Calibri"/>
-          <w:color w:val="5B646F"/>
+          <w:color w:val="5C6568"/>
           <w:sz w:val="17"/>
           <w:szCs w:val="17"/>
         </w:rPr>
@@ -2308,17 +2306,17 @@
       <w:r>
         <w:rPr>
           <w:rFonts w:ascii="Calibri" w:cs="Calibri" w:eastAsia="Calibri" w:hAnsi="Calibri"/>
-          <w:color w:val="5B646F"/>
+          <w:color w:val="5C6568"/>
           <w:sz w:val="17"/>
           <w:szCs w:val="17"/>
         </w:rPr>
         <w:t xml:space="preserve">  ·  </w:t>
       </w:r>
-      <w:hyperlink w:history="1" r:id="rIdgfcmn3w5dpuet6lkezhf-">
+      <w:hyperlink w:history="1" r:id="rId-w5tm12xxwe6vxbnadbpi">
         <w:r>
           <w:rPr>
             <w:rFonts w:ascii="Calibri" w:cs="Calibri" w:eastAsia="Calibri" w:hAnsi="Calibri"/>
-            <w:color w:val="275981"/>
+            <w:color w:val="006C6C"/>
             <w:sz w:val="17"/>
             <w:szCs w:val="17"/>
             <w:u w:val="single"/>
@@ -2329,17 +2327,17 @@
       <w:r>
         <w:rPr>
           <w:rFonts w:ascii="Calibri" w:cs="Calibri" w:eastAsia="Calibri" w:hAnsi="Calibri"/>
-          <w:color w:val="5B646F"/>
+          <w:color w:val="5C6568"/>
           <w:sz w:val="17"/>
           <w:szCs w:val="17"/>
         </w:rPr>
         <w:t xml:space="preserve">  ·  </w:t>
       </w:r>
-      <w:hyperlink w:history="1" r:id="rId-lfupl1fnpdjhy_xnk2ut">
+      <w:hyperlink w:history="1" r:id="rIdyn_xls7stbrmpaoibxmzo">
         <w:r>
           <w:rPr>
             <w:rFonts w:ascii="Calibri" w:cs="Calibri" w:eastAsia="Calibri" w:hAnsi="Calibri"/>
-            <w:color w:val="275981"/>
+            <w:color w:val="006C6C"/>
             <w:sz w:val="17"/>
             <w:szCs w:val="17"/>
             <w:u w:val="single"/>
@@ -2350,17 +2348,17 @@
       <w:r>
         <w:rPr>
           <w:rFonts w:ascii="Calibri" w:cs="Calibri" w:eastAsia="Calibri" w:hAnsi="Calibri"/>
-          <w:color w:val="5B646F"/>
+          <w:color w:val="5C6568"/>
           <w:sz w:val="17"/>
           <w:szCs w:val="17"/>
         </w:rPr>
         <w:t xml:space="preserve">  ·  </w:t>
       </w:r>
-      <w:hyperlink w:history="1" r:id="rIdw3oeto38kjwsat8m9eibj">
+      <w:hyperlink w:history="1" r:id="rIdjftvmhj58usprtryioewa">
         <w:r>
           <w:rPr>
             <w:rFonts w:ascii="Calibri" w:cs="Calibri" w:eastAsia="Calibri" w:hAnsi="Calibri"/>
-            <w:color w:val="275981"/>
+            <w:color w:val="006C6C"/>
             <w:sz w:val="17"/>
             <w:szCs w:val="17"/>
             <w:u w:val="single"/>
@@ -2379,7 +2377,7 @@
           <w:rFonts w:ascii="Calibri" w:cs="Calibri" w:eastAsia="Calibri" w:hAnsi="Calibri"/>
           <w:b/>
           <w:bCs/>
-          <w:color w:val="1A222B"/>
+          <w:color w:val="192123"/>
           <w:sz w:val="21"/>
           <w:szCs w:val="21"/>
         </w:rPr>
@@ -2393,7 +2391,7 @@
       <w:r>
         <w:rPr>
           <w:rFonts w:ascii="Calibri" w:cs="Calibri" w:eastAsia="Calibri" w:hAnsi="Calibri"/>
-          <w:color w:val="5B646F"/>
+          <w:color w:val="5C6568"/>
           <w:sz w:val="17"/>
           <w:szCs w:val="17"/>
         </w:rPr>
@@ -2402,17 +2400,17 @@
       <w:r>
         <w:rPr>
           <w:rFonts w:ascii="Calibri" w:cs="Calibri" w:eastAsia="Calibri" w:hAnsi="Calibri"/>
-          <w:color w:val="5B646F"/>
+          <w:color w:val="5C6568"/>
           <w:sz w:val="17"/>
           <w:szCs w:val="17"/>
         </w:rPr>
         <w:t xml:space="preserve">  ·  </w:t>
       </w:r>
-      <w:hyperlink w:history="1" r:id="rId6lhrggxuslkzjra0pmc2j">
+      <w:hyperlink w:history="1" r:id="rIdsuyjewek7bwa7tk_fmq4q">
         <w:r>
           <w:rPr>
             <w:rFonts w:ascii="Calibri" w:cs="Calibri" w:eastAsia="Calibri" w:hAnsi="Calibri"/>
-            <w:color w:val="275981"/>
+            <w:color w:val="006C6C"/>
             <w:sz w:val="17"/>
             <w:szCs w:val="17"/>
             <w:u w:val="single"/>
@@ -2423,17 +2421,17 @@
       <w:r>
         <w:rPr>
           <w:rFonts w:ascii="Calibri" w:cs="Calibri" w:eastAsia="Calibri" w:hAnsi="Calibri"/>
-          <w:color w:val="5B646F"/>
+          <w:color w:val="5C6568"/>
           <w:sz w:val="17"/>
           <w:szCs w:val="17"/>
         </w:rPr>
         <w:t xml:space="preserve">  ·  </w:t>
       </w:r>
-      <w:hyperlink w:history="1" r:id="rId_6os-voky0wkhvz5noyx9">
+      <w:hyperlink w:history="1" r:id="rIdz3hafrbre8vps4spmo4aa">
         <w:r>
           <w:rPr>
             <w:rFonts w:ascii="Calibri" w:cs="Calibri" w:eastAsia="Calibri" w:hAnsi="Calibri"/>
-            <w:color w:val="275981"/>
+            <w:color w:val="006C6C"/>
             <w:sz w:val="17"/>
             <w:szCs w:val="17"/>
             <w:u w:val="single"/>
@@ -2452,7 +2450,7 @@
           <w:rFonts w:ascii="Calibri" w:cs="Calibri" w:eastAsia="Calibri" w:hAnsi="Calibri"/>
           <w:b/>
           <w:bCs/>
-          <w:color w:val="1A222B"/>
+          <w:color w:val="192123"/>
           <w:sz w:val="21"/>
           <w:szCs w:val="21"/>
         </w:rPr>
@@ -2466,7 +2464,7 @@
       <w:r>
         <w:rPr>
           <w:rFonts w:ascii="Calibri" w:cs="Calibri" w:eastAsia="Calibri" w:hAnsi="Calibri"/>
-          <w:color w:val="5B646F"/>
+          <w:color w:val="5C6568"/>
           <w:sz w:val="17"/>
           <w:szCs w:val="17"/>
         </w:rPr>
@@ -2475,17 +2473,17 @@
       <w:r>
         <w:rPr>
           <w:rFonts w:ascii="Calibri" w:cs="Calibri" w:eastAsia="Calibri" w:hAnsi="Calibri"/>
-          <w:color w:val="5B646F"/>
+          <w:color w:val="5C6568"/>
           <w:sz w:val="17"/>
           <w:szCs w:val="17"/>
         </w:rPr>
         <w:t xml:space="preserve">  ·  </w:t>
       </w:r>
-      <w:hyperlink w:history="1" r:id="rIdqudixvurmlb7y-kzzb7jn">
+      <w:hyperlink w:history="1" r:id="rIdvg3t1ketnwg2o1btsm5r2">
         <w:r>
           <w:rPr>
             <w:rFonts w:ascii="Calibri" w:cs="Calibri" w:eastAsia="Calibri" w:hAnsi="Calibri"/>
-            <w:color w:val="275981"/>
+            <w:color w:val="006C6C"/>
             <w:sz w:val="17"/>
             <w:szCs w:val="17"/>
             <w:u w:val="single"/>
@@ -2496,17 +2494,17 @@
       <w:r>
         <w:rPr>
           <w:rFonts w:ascii="Calibri" w:cs="Calibri" w:eastAsia="Calibri" w:hAnsi="Calibri"/>
-          <w:color w:val="5B646F"/>
+          <w:color w:val="5C6568"/>
           <w:sz w:val="17"/>
           <w:szCs w:val="17"/>
         </w:rPr>
         <w:t xml:space="preserve">  ·  </w:t>
       </w:r>
-      <w:hyperlink w:history="1" r:id="rId4a9eelxgqwipkm46jmth-">
+      <w:hyperlink w:history="1" r:id="rIdxsu5o_3nksq3u8ve3lsw1">
         <w:r>
           <w:rPr>
             <w:rFonts w:ascii="Calibri" w:cs="Calibri" w:eastAsia="Calibri" w:hAnsi="Calibri"/>
-            <w:color w:val="275981"/>
+            <w:color w:val="006C6C"/>
             <w:sz w:val="17"/>
             <w:szCs w:val="17"/>
             <w:u w:val="single"/>
@@ -2525,7 +2523,7 @@
           <w:rFonts w:ascii="Calibri" w:cs="Calibri" w:eastAsia="Calibri" w:hAnsi="Calibri"/>
           <w:b/>
           <w:bCs/>
-          <w:color w:val="1A222B"/>
+          <w:color w:val="192123"/>
           <w:sz w:val="21"/>
           <w:szCs w:val="21"/>
         </w:rPr>
@@ -2539,7 +2537,7 @@
       <w:r>
         <w:rPr>
           <w:rFonts w:ascii="Calibri" w:cs="Calibri" w:eastAsia="Calibri" w:hAnsi="Calibri"/>
-          <w:color w:val="5B646F"/>
+          <w:color w:val="5C6568"/>
           <w:sz w:val="17"/>
           <w:szCs w:val="17"/>
         </w:rPr>
@@ -2548,17 +2546,17 @@
       <w:r>
         <w:rPr>
           <w:rFonts w:ascii="Calibri" w:cs="Calibri" w:eastAsia="Calibri" w:hAnsi="Calibri"/>
-          <w:color w:val="5B646F"/>
+          <w:color w:val="5C6568"/>
           <w:sz w:val="17"/>
           <w:szCs w:val="17"/>
         </w:rPr>
         <w:t xml:space="preserve">  ·  </w:t>
       </w:r>
-      <w:hyperlink w:history="1" r:id="rIdvjdvg-d5fbkssyilp4kxm">
+      <w:hyperlink w:history="1" r:id="rIdcy8f9ocanok4zvm8hihey">
         <w:r>
           <w:rPr>
             <w:rFonts w:ascii="Calibri" w:cs="Calibri" w:eastAsia="Calibri" w:hAnsi="Calibri"/>
-            <w:color w:val="275981"/>
+            <w:color w:val="006C6C"/>
             <w:sz w:val="17"/>
             <w:szCs w:val="17"/>
             <w:u w:val="single"/>
@@ -2569,17 +2567,17 @@
       <w:r>
         <w:rPr>
           <w:rFonts w:ascii="Calibri" w:cs="Calibri" w:eastAsia="Calibri" w:hAnsi="Calibri"/>
-          <w:color w:val="5B646F"/>
+          <w:color w:val="5C6568"/>
           <w:sz w:val="17"/>
           <w:szCs w:val="17"/>
         </w:rPr>
         <w:t xml:space="preserve">  ·  </w:t>
       </w:r>
-      <w:hyperlink w:history="1" r:id="rIdexmpwhzy1gssg5_xjktma">
+      <w:hyperlink w:history="1" r:id="rIdkohgrgazvo8iwnnu4v9qc">
         <w:r>
           <w:rPr>
             <w:rFonts w:ascii="Calibri" w:cs="Calibri" w:eastAsia="Calibri" w:hAnsi="Calibri"/>
-            <w:color w:val="275981"/>
+            <w:color w:val="006C6C"/>
             <w:sz w:val="17"/>
             <w:szCs w:val="17"/>
             <w:u w:val="single"/>
@@ -2598,7 +2596,7 @@
           <w:rFonts w:ascii="Calibri" w:cs="Calibri" w:eastAsia="Calibri" w:hAnsi="Calibri"/>
           <w:b/>
           <w:bCs/>
-          <w:color w:val="1A222B"/>
+          <w:color w:val="192123"/>
           <w:sz w:val="21"/>
           <w:szCs w:val="21"/>
         </w:rPr>
@@ -2612,7 +2610,7 @@
       <w:r>
         <w:rPr>
           <w:rFonts w:ascii="Calibri" w:cs="Calibri" w:eastAsia="Calibri" w:hAnsi="Calibri"/>
-          <w:color w:val="5B646F"/>
+          <w:color w:val="5C6568"/>
           <w:sz w:val="17"/>
           <w:szCs w:val="17"/>
         </w:rPr>
@@ -2621,17 +2619,17 @@
       <w:r>
         <w:rPr>
           <w:rFonts w:ascii="Calibri" w:cs="Calibri" w:eastAsia="Calibri" w:hAnsi="Calibri"/>
-          <w:color w:val="5B646F"/>
+          <w:color w:val="5C6568"/>
           <w:sz w:val="17"/>
           <w:szCs w:val="17"/>
         </w:rPr>
         <w:t xml:space="preserve">  ·  </w:t>
       </w:r>
-      <w:hyperlink w:history="1" r:id="rIdnxjj9ufpfltky9pwcqwqo">
+      <w:hyperlink w:history="1" r:id="rIdwk8hyjwj_9g2gqyil2wni">
         <w:r>
           <w:rPr>
             <w:rFonts w:ascii="Calibri" w:cs="Calibri" w:eastAsia="Calibri" w:hAnsi="Calibri"/>
-            <w:color w:val="275981"/>
+            <w:color w:val="006C6C"/>
             <w:sz w:val="17"/>
             <w:szCs w:val="17"/>
             <w:u w:val="single"/>
@@ -2642,17 +2640,17 @@
       <w:r>
         <w:rPr>
           <w:rFonts w:ascii="Calibri" w:cs="Calibri" w:eastAsia="Calibri" w:hAnsi="Calibri"/>
-          <w:color w:val="5B646F"/>
+          <w:color w:val="5C6568"/>
           <w:sz w:val="17"/>
           <w:szCs w:val="17"/>
         </w:rPr>
         <w:t xml:space="preserve">  ·  </w:t>
       </w:r>
-      <w:hyperlink w:history="1" r:id="rIdiyyuf6spblod03bhnpeuy">
+      <w:hyperlink w:history="1" r:id="rIdhpst51ldqf1of5qijnyfa">
         <w:r>
           <w:rPr>
             <w:rFonts w:ascii="Calibri" w:cs="Calibri" w:eastAsia="Calibri" w:hAnsi="Calibri"/>
-            <w:color w:val="275981"/>
+            <w:color w:val="006C6C"/>
             <w:sz w:val="17"/>
             <w:szCs w:val="17"/>
             <w:u w:val="single"/>
@@ -2671,7 +2669,7 @@
           <w:rFonts w:ascii="Calibri" w:cs="Calibri" w:eastAsia="Calibri" w:hAnsi="Calibri"/>
           <w:b/>
           <w:bCs/>
-          <w:color w:val="1A222B"/>
+          <w:color w:val="192123"/>
           <w:sz w:val="21"/>
           <w:szCs w:val="21"/>
         </w:rPr>
@@ -2685,7 +2683,7 @@
       <w:r>
         <w:rPr>
           <w:rFonts w:ascii="Calibri" w:cs="Calibri" w:eastAsia="Calibri" w:hAnsi="Calibri"/>
-          <w:color w:val="5B646F"/>
+          <w:color w:val="5C6568"/>
           <w:sz w:val="17"/>
           <w:szCs w:val="17"/>
         </w:rPr>
@@ -2694,17 +2692,17 @@
       <w:r>
         <w:rPr>
           <w:rFonts w:ascii="Calibri" w:cs="Calibri" w:eastAsia="Calibri" w:hAnsi="Calibri"/>
-          <w:color w:val="5B646F"/>
+          <w:color w:val="5C6568"/>
           <w:sz w:val="17"/>
           <w:szCs w:val="17"/>
         </w:rPr>
         <w:t xml:space="preserve">  ·  </w:t>
       </w:r>
-      <w:hyperlink w:history="1" r:id="rIdync5_qrfx5wholnr4yg4d">
+      <w:hyperlink w:history="1" r:id="rIdqkl9ro_s05adzoxsalsnp">
         <w:r>
           <w:rPr>
             <w:rFonts w:ascii="Calibri" w:cs="Calibri" w:eastAsia="Calibri" w:hAnsi="Calibri"/>
-            <w:color w:val="275981"/>
+            <w:color w:val="006C6C"/>
             <w:sz w:val="17"/>
             <w:szCs w:val="17"/>
             <w:u w:val="single"/>
@@ -2715,17 +2713,17 @@
       <w:r>
         <w:rPr>
           <w:rFonts w:ascii="Calibri" w:cs="Calibri" w:eastAsia="Calibri" w:hAnsi="Calibri"/>
-          <w:color w:val="5B646F"/>
+          <w:color w:val="5C6568"/>
           <w:sz w:val="17"/>
           <w:szCs w:val="17"/>
         </w:rPr>
         <w:t xml:space="preserve">  ·  </w:t>
       </w:r>
-      <w:hyperlink w:history="1" r:id="rIdnurovvnwbqqwyf05jgwcf">
+      <w:hyperlink w:history="1" r:id="rId1qy8ev86y_tfja8et1h30">
         <w:r>
           <w:rPr>
             <w:rFonts w:ascii="Calibri" w:cs="Calibri" w:eastAsia="Calibri" w:hAnsi="Calibri"/>
-            <w:color w:val="275981"/>
+            <w:color w:val="006C6C"/>
             <w:sz w:val="17"/>
             <w:szCs w:val="17"/>
             <w:u w:val="single"/>
@@ -2736,17 +2734,17 @@
       <w:r>
         <w:rPr>
           <w:rFonts w:ascii="Calibri" w:cs="Calibri" w:eastAsia="Calibri" w:hAnsi="Calibri"/>
-          <w:color w:val="5B646F"/>
+          <w:color w:val="5C6568"/>
           <w:sz w:val="17"/>
           <w:szCs w:val="17"/>
         </w:rPr>
         <w:t xml:space="preserve">  ·  </w:t>
       </w:r>
-      <w:hyperlink w:history="1" r:id="rIdgoufdoevesg-bmtjtw6a_">
+      <w:hyperlink w:history="1" r:id="rIdan0f69zldqj7dir2iap0t">
         <w:r>
           <w:rPr>
             <w:rFonts w:ascii="Calibri" w:cs="Calibri" w:eastAsia="Calibri" w:hAnsi="Calibri"/>
-            <w:color w:val="275981"/>
+            <w:color w:val="006C6C"/>
             <w:sz w:val="17"/>
             <w:szCs w:val="17"/>
             <w:u w:val="single"/>
@@ -2765,7 +2763,7 @@
           <w:rFonts w:ascii="Calibri" w:cs="Calibri" w:eastAsia="Calibri" w:hAnsi="Calibri"/>
           <w:b/>
           <w:bCs/>
-          <w:color w:val="1A222B"/>
+          <w:color w:val="192123"/>
           <w:sz w:val="21"/>
           <w:szCs w:val="21"/>
         </w:rPr>
@@ -2779,7 +2777,7 @@
       <w:r>
         <w:rPr>
           <w:rFonts w:ascii="Calibri" w:cs="Calibri" w:eastAsia="Calibri" w:hAnsi="Calibri"/>
-          <w:color w:val="5B646F"/>
+          <w:color w:val="5C6568"/>
           <w:sz w:val="17"/>
           <w:szCs w:val="17"/>
         </w:rPr>
@@ -2788,17 +2786,17 @@
       <w:r>
         <w:rPr>
           <w:rFonts w:ascii="Calibri" w:cs="Calibri" w:eastAsia="Calibri" w:hAnsi="Calibri"/>
-          <w:color w:val="5B646F"/>
+          <w:color w:val="5C6568"/>
           <w:sz w:val="17"/>
           <w:szCs w:val="17"/>
         </w:rPr>
         <w:t xml:space="preserve">  ·  </w:t>
       </w:r>
-      <w:hyperlink w:history="1" r:id="rIdynpwa4ts0gg7cblj-hpw_">
+      <w:hyperlink w:history="1" r:id="rIdwhxqmjidurkidusm266il">
         <w:r>
           <w:rPr>
             <w:rFonts w:ascii="Calibri" w:cs="Calibri" w:eastAsia="Calibri" w:hAnsi="Calibri"/>
-            <w:color w:val="275981"/>
+            <w:color w:val="006C6C"/>
             <w:sz w:val="17"/>
             <w:szCs w:val="17"/>
             <w:u w:val="single"/>
@@ -2817,7 +2815,7 @@
           <w:rFonts w:ascii="Calibri" w:cs="Calibri" w:eastAsia="Calibri" w:hAnsi="Calibri"/>
           <w:b/>
           <w:bCs/>
-          <w:color w:val="1A222B"/>
+          <w:color w:val="192123"/>
           <w:sz w:val="21"/>
           <w:szCs w:val="21"/>
         </w:rPr>
@@ -2831,7 +2829,7 @@
       <w:r>
         <w:rPr>
           <w:rFonts w:ascii="Calibri" w:cs="Calibri" w:eastAsia="Calibri" w:hAnsi="Calibri"/>
-          <w:color w:val="5B646F"/>
+          <w:color w:val="5C6568"/>
           <w:sz w:val="17"/>
           <w:szCs w:val="17"/>
         </w:rPr>
@@ -2840,17 +2838,17 @@
       <w:r>
         <w:rPr>
           <w:rFonts w:ascii="Calibri" w:cs="Calibri" w:eastAsia="Calibri" w:hAnsi="Calibri"/>
-          <w:color w:val="5B646F"/>
+          <w:color w:val="5C6568"/>
           <w:sz w:val="17"/>
           <w:szCs w:val="17"/>
         </w:rPr>
         <w:t xml:space="preserve">  ·  </w:t>
       </w:r>
-      <w:hyperlink w:history="1" r:id="rIdkx35oagfrniur76waum4o">
+      <w:hyperlink w:history="1" r:id="rIdqk5cy6om2hmhghdlrpn8g">
         <w:r>
           <w:rPr>
             <w:rFonts w:ascii="Calibri" w:cs="Calibri" w:eastAsia="Calibri" w:hAnsi="Calibri"/>
-            <w:color w:val="275981"/>
+            <w:color w:val="006C6C"/>
             <w:sz w:val="17"/>
             <w:szCs w:val="17"/>
             <w:u w:val="single"/>
@@ -2869,7 +2867,7 @@
           <w:rFonts w:ascii="Calibri" w:cs="Calibri" w:eastAsia="Calibri" w:hAnsi="Calibri"/>
           <w:b/>
           <w:bCs/>
-          <w:color w:val="1A222B"/>
+          <w:color w:val="192123"/>
           <w:sz w:val="21"/>
           <w:szCs w:val="21"/>
         </w:rPr>
@@ -2883,7 +2881,7 @@
       <w:r>
         <w:rPr>
           <w:rFonts w:ascii="Calibri" w:cs="Calibri" w:eastAsia="Calibri" w:hAnsi="Calibri"/>
-          <w:color w:val="5B646F"/>
+          <w:color w:val="5C6568"/>
           <w:sz w:val="17"/>
           <w:szCs w:val="17"/>
         </w:rPr>
@@ -2892,17 +2890,17 @@
       <w:r>
         <w:rPr>
           <w:rFonts w:ascii="Calibri" w:cs="Calibri" w:eastAsia="Calibri" w:hAnsi="Calibri"/>
-          <w:color w:val="5B646F"/>
+          <w:color w:val="5C6568"/>
           <w:sz w:val="17"/>
           <w:szCs w:val="17"/>
         </w:rPr>
         <w:t xml:space="preserve">  ·  </w:t>
       </w:r>
-      <w:hyperlink w:history="1" r:id="rIdkozivcy2ydndvyh9j_qur">
+      <w:hyperlink w:history="1" r:id="rIdvtanjjrizkzzqh50unnlt">
         <w:r>
           <w:rPr>
             <w:rFonts w:ascii="Calibri" w:cs="Calibri" w:eastAsia="Calibri" w:hAnsi="Calibri"/>
-            <w:color w:val="275981"/>
+            <w:color w:val="006C6C"/>
             <w:sz w:val="17"/>
             <w:szCs w:val="17"/>
             <w:u w:val="single"/>
@@ -2913,17 +2911,17 @@
       <w:r>
         <w:rPr>
           <w:rFonts w:ascii="Calibri" w:cs="Calibri" w:eastAsia="Calibri" w:hAnsi="Calibri"/>
-          <w:color w:val="5B646F"/>
+          <w:color w:val="5C6568"/>
           <w:sz w:val="17"/>
           <w:szCs w:val="17"/>
         </w:rPr>
         <w:t xml:space="preserve">  ·  </w:t>
       </w:r>
-      <w:hyperlink w:history="1" r:id="rIdt8gtegwwkaio7ccme6hkx">
+      <w:hyperlink w:history="1" r:id="rIdsku1smcqfqpg0utb4dqd5">
         <w:r>
           <w:rPr>
             <w:rFonts w:ascii="Calibri" w:cs="Calibri" w:eastAsia="Calibri" w:hAnsi="Calibri"/>
-            <w:color w:val="275981"/>
+            <w:color w:val="006C6C"/>
             <w:sz w:val="17"/>
             <w:szCs w:val="17"/>
             <w:u w:val="single"/>
@@ -2991,7 +2989,7 @@
     <w:r>
       <w:rPr>
         <w:rFonts w:ascii="Calibri" w:cs="Calibri" w:eastAsia="Calibri" w:hAnsi="Calibri"/>
-        <w:color w:val="5B646F"/>
+        <w:color w:val="5C6568"/>
         <w:sz w:val="16"/>
         <w:szCs w:val="16"/>
       </w:rPr>
@@ -3000,7 +2998,7 @@
     <w:r>
       <w:rPr>
         <w:rFonts w:ascii="Calibri" w:cs="Calibri" w:eastAsia="Calibri" w:hAnsi="Calibri"/>
-        <w:color w:val="5B646F"/>
+        <w:color w:val="5C6568"/>
         <w:sz w:val="16"/>
         <w:szCs w:val="16"/>
       </w:rPr>
@@ -3152,7 +3150,7 @@
         <w:ind w:left="300" w:hanging="220"/>
       </w:pPr>
       <w:rPr>
-        <w:color w:val="5B646F"/>
+        <w:color w:val="5C6568"/>
       </w:rPr>
     </w:lvl>
   </w:abstractNum>
@@ -3176,8 +3174,8 @@
   <w:docDefaults>
     <w:rPrDefault>
       <w:rPr>
-        <w:rFonts w:ascii="Cambria" w:cs="Cambria" w:eastAsia="Cambria" w:hAnsi="Cambria"/>
-        <w:color w:val="1A222B"/>
+        <w:rFonts w:ascii="Calibri" w:cs="Calibri" w:eastAsia="Calibri" w:hAnsi="Calibri"/>
+        <w:color w:val="192123"/>
         <w:sz w:val="21"/>
         <w:szCs w:val="21"/>
       </w:rPr>

</xml_diff>

<commit_message>
Agregar versión en inglés, CV en inglés e iconos SVG
Páginas en/ (portada y CV completo) en inglés de EE. UU. con selector
ES/EN y hreflang. CV en inglés en PDF (2 y 4 páginas), Word, Markdown
y LaTeX, con QR y vCard que apuntan a la versión en inglés. Iconos
Lucide de trazo uniforme en contacto (sin emojis). El estilo LaTeX
ahora elige idioma, pie de página y QR según la versión.

Co-Authored-By: Claude Opus 5.5 <noreply@anthropic.com>
Claude-Session: https://claude.ai/code/session_0148DUiBNtsfdKywDatfgTQc
</commit_message>
<xml_diff>
--- a/cv/Wilson_Ordonez_CV.docx
+++ b/cv/Wilson_Ordonez_CV.docx
@@ -19,7 +19,7 @@
             <wp:extent cx="685800" cy="685800"/>
             <wp:effectExtent t="0" r="0" b="0" l="0"/>
             <wp:wrapSquare wrapText="bothSides" distL="114300"/>
-            <wp:docPr id="1" name="qr_web" descr="Código QR a https://negraldi.github.io/" title="QR"/>
+            <wp:docPr id="1" name="qr_web" descr="QR https://negraldi.github.io/" title="QR"/>
             <wp:cNvGraphicFramePr>
               <a:graphicFrameLocks xmlns:a="http://schemas.openxmlformats.org/drawingml/2006/main" noChangeAspect="1"/>
             </wp:cNvGraphicFramePr>
@@ -102,7 +102,7 @@
         </w:rPr>
         <w:t xml:space="preserve">  ·  </w:t>
       </w:r>
-      <w:hyperlink w:history="1" r:id="rId9bixw2_533xy3xacz4qit">
+      <w:hyperlink w:history="1" r:id="rIdbl0oiopk2sd0f_7bl9nwo">
         <w:r>
           <w:rPr>
             <w:rFonts w:ascii="Calibri" w:cs="Calibri" w:eastAsia="Calibri" w:hAnsi="Calibri"/>
@@ -123,7 +123,7 @@
         </w:rPr>
         <w:t xml:space="preserve">  ·  </w:t>
       </w:r>
-      <w:hyperlink w:history="1" r:id="rIdskn35pfn3kvne7xl7twst">
+      <w:hyperlink w:history="1" r:id="rIdi8jhfi6egbitqdma69ne3">
         <w:r>
           <w:rPr>
             <w:rFonts w:ascii="Calibri" w:cs="Calibri" w:eastAsia="Calibri" w:hAnsi="Calibri"/>
@@ -144,7 +144,7 @@
         </w:rPr>
         <w:t xml:space="preserve">  ·  </w:t>
       </w:r>
-      <w:hyperlink w:history="1" r:id="rIdgbcrqfip6g94f0va2_m0m">
+      <w:hyperlink w:history="1" r:id="rIdpdqfiwhozihqwlgg37gvs">
         <w:r>
           <w:rPr>
             <w:rFonts w:ascii="Calibri" w:cs="Calibri" w:eastAsia="Calibri" w:hAnsi="Calibri"/>
@@ -165,7 +165,7 @@
         </w:rPr>
         <w:t xml:space="preserve">  ·  </w:t>
       </w:r>
-      <w:hyperlink w:history="1" r:id="rIdgjbbd0evcveh4_qunbqnf">
+      <w:hyperlink w:history="1" r:id="rId7yuiqpfmwlgqeqgjyjpks">
         <w:r>
           <w:rPr>
             <w:rFonts w:ascii="Calibri" w:cs="Calibri" w:eastAsia="Calibri" w:hAnsi="Calibri"/>
@@ -186,7 +186,7 @@
         </w:rPr>
         <w:t xml:space="preserve">  ·  </w:t>
       </w:r>
-      <w:hyperlink w:history="1" r:id="rId7fyobjy1wlgw_3ilwlyuz">
+      <w:hyperlink w:history="1" r:id="rIdk09qmprbw2nc2oairpc21">
         <w:r>
           <w:rPr>
             <w:rFonts w:ascii="Calibri" w:cs="Calibri" w:eastAsia="Calibri" w:hAnsi="Calibri"/>
@@ -1506,7 +1506,7 @@
       <w:pPr>
         <w:spacing w:after="60" w:before="0" w:line="276"/>
       </w:pPr>
-      <w:hyperlink w:history="1" r:id="rIdcokd5kisxcry71hlqliif">
+      <w:hyperlink w:history="1" r:id="rIdimhrhbbuctbvljriwctd8">
         <w:r>
           <w:rPr>
             <w:rFonts w:ascii="Calibri" w:cs="Calibri" w:eastAsia="Calibri" w:hAnsi="Calibri"/>
@@ -1621,7 +1621,7 @@
       <w:pPr>
         <w:spacing w:after="60" w:before="0" w:line="276"/>
       </w:pPr>
-      <w:hyperlink w:history="1" r:id="rId9s5u4vi8tl26ymlepcnbi">
+      <w:hyperlink w:history="1" r:id="rIdmbg88fc4uy0lhyjdjnooi">
         <w:r>
           <w:rPr>
             <w:rFonts w:ascii="Calibri" w:cs="Calibri" w:eastAsia="Calibri" w:hAnsi="Calibri"/>
@@ -1642,7 +1642,7 @@
         </w:rPr>
         <w:t xml:space="preserve">  ·  </w:t>
       </w:r>
-      <w:hyperlink w:history="1" r:id="rIdps_e3gq92g9rcbmk5dg3a">
+      <w:hyperlink w:history="1" r:id="rId6hirhav1n6ayj1gndh3hq">
         <w:r>
           <w:rPr>
             <w:rFonts w:ascii="Calibri" w:cs="Calibri" w:eastAsia="Calibri" w:hAnsi="Calibri"/>
@@ -1663,7 +1663,7 @@
         </w:rPr>
         <w:t xml:space="preserve">  ·  </w:t>
       </w:r>
-      <w:hyperlink w:history="1" r:id="rIdmb490ehpnoxubvc_r49oj">
+      <w:hyperlink w:history="1" r:id="rIdsj0zebucc9acb-r0-btap">
         <w:r>
           <w:rPr>
             <w:rFonts w:ascii="Calibri" w:cs="Calibri" w:eastAsia="Calibri" w:hAnsi="Calibri"/>
@@ -2312,7 +2312,7 @@
         </w:rPr>
         <w:t xml:space="preserve">  ·  </w:t>
       </w:r>
-      <w:hyperlink w:history="1" r:id="rId-w5tm12xxwe6vxbnadbpi">
+      <w:hyperlink w:history="1" r:id="rId-zs6mhbpjr30izcwzvbrc">
         <w:r>
           <w:rPr>
             <w:rFonts w:ascii="Calibri" w:cs="Calibri" w:eastAsia="Calibri" w:hAnsi="Calibri"/>
@@ -2333,7 +2333,7 @@
         </w:rPr>
         <w:t xml:space="preserve">  ·  </w:t>
       </w:r>
-      <w:hyperlink w:history="1" r:id="rIdyn_xls7stbrmpaoibxmzo">
+      <w:hyperlink w:history="1" r:id="rIdiz_yxfjdw--1nsjpsnx46">
         <w:r>
           <w:rPr>
             <w:rFonts w:ascii="Calibri" w:cs="Calibri" w:eastAsia="Calibri" w:hAnsi="Calibri"/>
@@ -2354,7 +2354,7 @@
         </w:rPr>
         <w:t xml:space="preserve">  ·  </w:t>
       </w:r>
-      <w:hyperlink w:history="1" r:id="rIdjftvmhj58usprtryioewa">
+      <w:hyperlink w:history="1" r:id="rIdcc3_zo0oagab5mo3eskpa">
         <w:r>
           <w:rPr>
             <w:rFonts w:ascii="Calibri" w:cs="Calibri" w:eastAsia="Calibri" w:hAnsi="Calibri"/>
@@ -2406,7 +2406,7 @@
         </w:rPr>
         <w:t xml:space="preserve">  ·  </w:t>
       </w:r>
-      <w:hyperlink w:history="1" r:id="rIdsuyjewek7bwa7tk_fmq4q">
+      <w:hyperlink w:history="1" r:id="rId2zyuefuan5gmtzylcyjyo">
         <w:r>
           <w:rPr>
             <w:rFonts w:ascii="Calibri" w:cs="Calibri" w:eastAsia="Calibri" w:hAnsi="Calibri"/>
@@ -2427,7 +2427,7 @@
         </w:rPr>
         <w:t xml:space="preserve">  ·  </w:t>
       </w:r>
-      <w:hyperlink w:history="1" r:id="rIdz3hafrbre8vps4spmo4aa">
+      <w:hyperlink w:history="1" r:id="rIdqbtsre41q4bsgn4pbuypg">
         <w:r>
           <w:rPr>
             <w:rFonts w:ascii="Calibri" w:cs="Calibri" w:eastAsia="Calibri" w:hAnsi="Calibri"/>
@@ -2479,7 +2479,7 @@
         </w:rPr>
         <w:t xml:space="preserve">  ·  </w:t>
       </w:r>
-      <w:hyperlink w:history="1" r:id="rIdvg3t1ketnwg2o1btsm5r2">
+      <w:hyperlink w:history="1" r:id="rIdkynvpiikhtx3cnwiv6qlt">
         <w:r>
           <w:rPr>
             <w:rFonts w:ascii="Calibri" w:cs="Calibri" w:eastAsia="Calibri" w:hAnsi="Calibri"/>
@@ -2500,7 +2500,7 @@
         </w:rPr>
         <w:t xml:space="preserve">  ·  </w:t>
       </w:r>
-      <w:hyperlink w:history="1" r:id="rIdxsu5o_3nksq3u8ve3lsw1">
+      <w:hyperlink w:history="1" r:id="rIdkrrgdml7v-zlkd0q52s-5">
         <w:r>
           <w:rPr>
             <w:rFonts w:ascii="Calibri" w:cs="Calibri" w:eastAsia="Calibri" w:hAnsi="Calibri"/>
@@ -2552,7 +2552,7 @@
         </w:rPr>
         <w:t xml:space="preserve">  ·  </w:t>
       </w:r>
-      <w:hyperlink w:history="1" r:id="rIdcy8f9ocanok4zvm8hihey">
+      <w:hyperlink w:history="1" r:id="rIdkvjzldrjpjgqpqmvcawhn">
         <w:r>
           <w:rPr>
             <w:rFonts w:ascii="Calibri" w:cs="Calibri" w:eastAsia="Calibri" w:hAnsi="Calibri"/>
@@ -2573,7 +2573,7 @@
         </w:rPr>
         <w:t xml:space="preserve">  ·  </w:t>
       </w:r>
-      <w:hyperlink w:history="1" r:id="rIdkohgrgazvo8iwnnu4v9qc">
+      <w:hyperlink w:history="1" r:id="rIdt1abx4pdv4wr5catctusc">
         <w:r>
           <w:rPr>
             <w:rFonts w:ascii="Calibri" w:cs="Calibri" w:eastAsia="Calibri" w:hAnsi="Calibri"/>
@@ -2625,7 +2625,7 @@
         </w:rPr>
         <w:t xml:space="preserve">  ·  </w:t>
       </w:r>
-      <w:hyperlink w:history="1" r:id="rIdwk8hyjwj_9g2gqyil2wni">
+      <w:hyperlink w:history="1" r:id="rIdime_vwwmyzy4b_m-2hnkz">
         <w:r>
           <w:rPr>
             <w:rFonts w:ascii="Calibri" w:cs="Calibri" w:eastAsia="Calibri" w:hAnsi="Calibri"/>
@@ -2646,7 +2646,7 @@
         </w:rPr>
         <w:t xml:space="preserve">  ·  </w:t>
       </w:r>
-      <w:hyperlink w:history="1" r:id="rIdhpst51ldqf1of5qijnyfa">
+      <w:hyperlink w:history="1" r:id="rIdhobpg-eq-bpazhhsrhz6s">
         <w:r>
           <w:rPr>
             <w:rFonts w:ascii="Calibri" w:cs="Calibri" w:eastAsia="Calibri" w:hAnsi="Calibri"/>
@@ -2698,7 +2698,7 @@
         </w:rPr>
         <w:t xml:space="preserve">  ·  </w:t>
       </w:r>
-      <w:hyperlink w:history="1" r:id="rIdqkl9ro_s05adzoxsalsnp">
+      <w:hyperlink w:history="1" r:id="rIdskzu5rt1jx3lgerh0eenk">
         <w:r>
           <w:rPr>
             <w:rFonts w:ascii="Calibri" w:cs="Calibri" w:eastAsia="Calibri" w:hAnsi="Calibri"/>
@@ -2719,7 +2719,7 @@
         </w:rPr>
         <w:t xml:space="preserve">  ·  </w:t>
       </w:r>
-      <w:hyperlink w:history="1" r:id="rId1qy8ev86y_tfja8et1h30">
+      <w:hyperlink w:history="1" r:id="rIdpg-eo7ax2l4yi5imenbjj">
         <w:r>
           <w:rPr>
             <w:rFonts w:ascii="Calibri" w:cs="Calibri" w:eastAsia="Calibri" w:hAnsi="Calibri"/>
@@ -2740,7 +2740,7 @@
         </w:rPr>
         <w:t xml:space="preserve">  ·  </w:t>
       </w:r>
-      <w:hyperlink w:history="1" r:id="rIdan0f69zldqj7dir2iap0t">
+      <w:hyperlink w:history="1" r:id="rIdq5h8ochxmrkh1xljz6foi">
         <w:r>
           <w:rPr>
             <w:rFonts w:ascii="Calibri" w:cs="Calibri" w:eastAsia="Calibri" w:hAnsi="Calibri"/>
@@ -2792,7 +2792,7 @@
         </w:rPr>
         <w:t xml:space="preserve">  ·  </w:t>
       </w:r>
-      <w:hyperlink w:history="1" r:id="rIdwhxqmjidurkidusm266il">
+      <w:hyperlink w:history="1" r:id="rId4p8hhf5lv-8jtz2ufsrls">
         <w:r>
           <w:rPr>
             <w:rFonts w:ascii="Calibri" w:cs="Calibri" w:eastAsia="Calibri" w:hAnsi="Calibri"/>
@@ -2844,7 +2844,7 @@
         </w:rPr>
         <w:t xml:space="preserve">  ·  </w:t>
       </w:r>
-      <w:hyperlink w:history="1" r:id="rIdqk5cy6om2hmhghdlrpn8g">
+      <w:hyperlink w:history="1" r:id="rIdedwf9czhrrhc9gxpoi9xx">
         <w:r>
           <w:rPr>
             <w:rFonts w:ascii="Calibri" w:cs="Calibri" w:eastAsia="Calibri" w:hAnsi="Calibri"/>
@@ -2896,7 +2896,7 @@
         </w:rPr>
         <w:t xml:space="preserve">  ·  </w:t>
       </w:r>
-      <w:hyperlink w:history="1" r:id="rIdvtanjjrizkzzqh50unnlt">
+      <w:hyperlink w:history="1" r:id="rIdpu4ba5jdk4ayzjrwcmhqg">
         <w:r>
           <w:rPr>
             <w:rFonts w:ascii="Calibri" w:cs="Calibri" w:eastAsia="Calibri" w:hAnsi="Calibri"/>
@@ -2917,7 +2917,7 @@
         </w:rPr>
         <w:t xml:space="preserve">  ·  </w:t>
       </w:r>
-      <w:hyperlink w:history="1" r:id="rIdsku1smcqfqpg0utb4dqd5">
+      <w:hyperlink w:history="1" r:id="rIdt6hmixre_yxadqqwat3u8">
         <w:r>
           <w:rPr>
             <w:rFonts w:ascii="Calibri" w:cs="Calibri" w:eastAsia="Calibri" w:hAnsi="Calibri"/>

</xml_diff>